<commit_message>
Updated asset impact feature documentation
</commit_message>
<xml_diff>
--- a/docs/future-features/MIAE_Manufacturing_Asset_Impact_Intelligence.docx
+++ b/docs/future-features/MIAE_Manufacturing_Asset_Impact_Intelligence.docx
@@ -1507,8 +1507,6 @@
     <w:p/>
     <w:p/>
     <w:p/>
-    <w:p/>
-    <w:p/>
     <w:p>
       <w:r>
         <w:rPr>
@@ -1610,8 +1608,46 @@
         <w:pStyle w:val="ListBullet"/>
       </w:pPr>
       <w:r>
-        <w:t>WORK_CENTER -[:HAS_EQUIPMENT]-&gt; EQUIPMENT</w:t>
-      </w:r>
+        <w:t>WORK_CENTER -</w:t>
+      </w:r>
+      <w:proofErr w:type="gramStart"/>
+      <w:r>
+        <w:t>[:HAS</w:t>
+      </w:r>
+      <w:proofErr w:type="gramEnd"/>
+      <w:r>
+        <w:t>_EQUIPMENT]-&gt; EQUIPMENT</w:t>
+      </w:r>
+    </w:p>
+    <w:p>
+      <w:pPr>
+        <w:pStyle w:val="ListBullet"/>
+        <w:numPr>
+          <w:ilvl w:val="0"/>
+          <w:numId w:val="0"/>
+        </w:numPr>
+        <w:ind w:left="360" w:hanging="360"/>
+      </w:pPr>
+    </w:p>
+    <w:p>
+      <w:pPr>
+        <w:pStyle w:val="ListBullet"/>
+        <w:numPr>
+          <w:ilvl w:val="0"/>
+          <w:numId w:val="0"/>
+        </w:numPr>
+        <w:ind w:left="360" w:hanging="360"/>
+      </w:pPr>
+    </w:p>
+    <w:p>
+      <w:pPr>
+        <w:pStyle w:val="ListBullet"/>
+        <w:numPr>
+          <w:ilvl w:val="0"/>
+          <w:numId w:val="0"/>
+        </w:numPr>
+        <w:ind w:left="360" w:hanging="360"/>
+      </w:pPr>
     </w:p>
     <w:p>
       <w:pPr>
@@ -1973,6 +2009,7 @@
         <w:rPr>
           <w:b/>
           <w:bCs/>
+          <w:color w:val="984806" w:themeColor="accent6" w:themeShade="80"/>
           <w:sz w:val="24"/>
           <w:szCs w:val="24"/>
         </w:rPr>
@@ -1980,264 +2017,1486 @@
       </w:r>
       <w:r>
         <w:rPr>
+          <w:color w:val="984806" w:themeColor="accent6" w:themeShade="80"/>
           <w:sz w:val="24"/>
           <w:szCs w:val="24"/>
         </w:rPr>
-        <w:t xml:space="preserve"> collection of manufacturing Operations associated with the Work Order. Each Operation captures the execution sequence, operation name, status, and the Work Center where it is performed.</w:t>
-      </w:r>
-    </w:p>
-    <w:p>
-      <w:r>
-        <w:t>POST /</w:t>
-      </w:r>
-      <w:proofErr w:type="spellStart"/>
-      <w:r>
-        <w:t>api</w:t>
-      </w:r>
-      <w:proofErr w:type="spellEnd"/>
-      <w:r>
-        <w:t>/v1/work-orders</w:t>
-      </w:r>
-      <w:r>
-        <w:br/>
-      </w:r>
-      <w:r>
-        <w:br/>
-        <w:t>{</w:t>
-      </w:r>
-      <w:r>
-        <w:br/>
-        <w:t xml:space="preserve">  "workOrderId":"WO-1001",</w:t>
-      </w:r>
-      <w:r>
-        <w:br/>
-        <w:t xml:space="preserve">  "revisionId":"P100-REV-B",</w:t>
-      </w:r>
-      <w:r>
-        <w:br/>
-        <w:t xml:space="preserve">  "</w:t>
-      </w:r>
-      <w:proofErr w:type="spellStart"/>
-      <w:r>
-        <w:t>status":"RELEASED</w:t>
-      </w:r>
-      <w:proofErr w:type="spellEnd"/>
-      <w:r>
-        <w:t>",</w:t>
-      </w:r>
-      <w:r>
-        <w:br/>
-        <w:t xml:space="preserve">  "remainingQty":50,</w:t>
-      </w:r>
-      <w:r>
-        <w:br/>
-        <w:t xml:space="preserve">  "</w:t>
-      </w:r>
-      <w:proofErr w:type="spellStart"/>
-      <w:r>
-        <w:t>priority":"HIGH</w:t>
-      </w:r>
-      <w:proofErr w:type="spellEnd"/>
-      <w:r>
-        <w:t>",</w:t>
-      </w:r>
-      <w:r>
-        <w:br/>
-        <w:t xml:space="preserve">  "plannedCompletionDate":"2026-02-20",</w:t>
-      </w:r>
-      <w:r>
-        <w:br/>
-        <w:t xml:space="preserve">  "operations":[</w:t>
-      </w:r>
-      <w:r>
-        <w:br/>
-        <w:t xml:space="preserve">    {</w:t>
-      </w:r>
-      <w:r>
-        <w:br/>
-        <w:t xml:space="preserve">      "</w:t>
-      </w:r>
-      <w:proofErr w:type="spellStart"/>
+        <w:t xml:space="preserve"> </w:t>
+      </w:r>
       <w:r>
         <w:rPr>
           <w:sz w:val="24"/>
           <w:szCs w:val="24"/>
         </w:rPr>
-        <w:t>operation</w:t>
-      </w:r>
-      <w:r>
-        <w:rPr>
-          <w:sz w:val="24"/>
-          <w:szCs w:val="24"/>
-        </w:rPr>
-        <w:t>Sequence</w:t>
+        <w:t>collection of manufacturing Operations associated with the Work Order. Each Operation captures the execution sequence, operation name, status, and the Work Center where it is performed.</w:t>
+      </w:r>
+    </w:p>
+    <w:p>
+      <w:r>
+        <w:t>POST /</w:t>
+      </w:r>
+      <w:proofErr w:type="spellStart"/>
+      <w:r>
+        <w:t>api</w:t>
       </w:r>
       <w:proofErr w:type="spellEnd"/>
       <w:r>
-        <w:t xml:space="preserve"> </w:t>
-      </w:r>
-      <w:r>
-        <w:t>":10,</w:t>
-      </w:r>
-      <w:r>
-        <w:br/>
-        <w:t xml:space="preserve">      "</w:t>
-      </w:r>
-      <w:r>
-        <w:rPr>
-          <w:sz w:val="24"/>
-          <w:szCs w:val="24"/>
-        </w:rPr>
-        <w:t>operationId</w:t>
-      </w:r>
-      <w:r>
-        <w:t>":10,</w:t>
-      </w:r>
-      <w:r>
-        <w:br/>
-        <w:t xml:space="preserve">      "</w:t>
-      </w:r>
-      <w:proofErr w:type="spellStart"/>
-      <w:r>
-        <w:t>name":"SMT</w:t>
-      </w:r>
-      <w:proofErr w:type="spellEnd"/>
-      <w:r>
-        <w:t xml:space="preserve"> Assembly",</w:t>
-      </w:r>
-      <w:r>
-        <w:br/>
-        <w:t xml:space="preserve">      "</w:t>
-      </w:r>
-      <w:proofErr w:type="spellStart"/>
-      <w:r>
-        <w:t>status":"NOT_STARTED</w:t>
-      </w:r>
-      <w:proofErr w:type="spellEnd"/>
-      <w:r>
-        <w:t>",</w:t>
-      </w:r>
-      <w:r>
-        <w:br/>
-        <w:t xml:space="preserve">      "</w:t>
-      </w:r>
-      <w:proofErr w:type="spellStart"/>
-      <w:r>
-        <w:t>workCenterId</w:t>
-      </w:r>
-      <w:proofErr w:type="spellEnd"/>
-      <w:r>
-        <w:t xml:space="preserve"> </w:t>
-      </w:r>
-      <w:r>
-        <w:t>":"WC-SMT"</w:t>
-      </w:r>
-      <w:r>
-        <w:br/>
-        <w:t xml:space="preserve">    },</w:t>
-      </w:r>
-      <w:r>
-        <w:br/>
-        <w:t xml:space="preserve">    {</w:t>
-      </w:r>
-      <w:r>
-        <w:br/>
-        <w:t xml:space="preserve">      "</w:t>
-      </w:r>
-      <w:proofErr w:type="spellStart"/>
-      <w:r>
-        <w:rPr>
-          <w:sz w:val="24"/>
-          <w:szCs w:val="24"/>
-        </w:rPr>
-        <w:t>operation</w:t>
-      </w:r>
-      <w:r>
-        <w:rPr>
-          <w:sz w:val="24"/>
-          <w:szCs w:val="24"/>
-        </w:rPr>
-        <w:t>Sequence</w:t>
-      </w:r>
-      <w:proofErr w:type="spellEnd"/>
-      <w:r>
-        <w:t xml:space="preserve"> </w:t>
-      </w:r>
-      <w:r>
-        <w:t>":20,</w:t>
-      </w:r>
-      <w:r>
-        <w:br/>
-        <w:t xml:space="preserve">      "</w:t>
-      </w:r>
-      <w:r>
-        <w:rPr>
-          <w:sz w:val="24"/>
-          <w:szCs w:val="24"/>
-        </w:rPr>
-        <w:t>operationId</w:t>
-      </w:r>
-      <w:r>
-        <w:t>":20,</w:t>
-      </w:r>
-      <w:r>
-        <w:br/>
-        <w:t xml:space="preserve">      "</w:t>
-      </w:r>
-      <w:proofErr w:type="spellStart"/>
-      <w:r>
-        <w:t>name":"AOI</w:t>
-      </w:r>
-      <w:proofErr w:type="spellEnd"/>
-      <w:r>
-        <w:t xml:space="preserve"> Inspection",</w:t>
-      </w:r>
-      <w:r>
-        <w:br/>
-        <w:t xml:space="preserve">      "</w:t>
-      </w:r>
-      <w:proofErr w:type="spellStart"/>
-      <w:r>
-        <w:t>status":"NOT_STARTED</w:t>
-      </w:r>
-      <w:proofErr w:type="spellEnd"/>
-      <w:r>
-        <w:t>",</w:t>
-      </w:r>
-      <w:r>
-        <w:br/>
-        <w:t xml:space="preserve">      "</w:t>
-      </w:r>
-      <w:proofErr w:type="spellStart"/>
-      <w:r>
-        <w:t>workCenterId</w:t>
-      </w:r>
-      <w:proofErr w:type="spellEnd"/>
-      <w:r>
-        <w:t xml:space="preserve"> </w:t>
-      </w:r>
-      <w:r>
-        <w:t>":"WC-AOI"</w:t>
-      </w:r>
-      <w:r>
-        <w:br/>
-        <w:t xml:space="preserve">    }</w:t>
-      </w:r>
-      <w:r>
-        <w:br/>
-        <w:t xml:space="preserve">  ]</w:t>
-      </w:r>
-      <w:r>
-        <w:br/>
-        <w:t>}</w:t>
+        <w:t>/v1/work-orders</w:t>
       </w:r>
     </w:p>
+    <w:tbl>
+      <w:tblPr>
+        <w:tblStyle w:val="TableGrid"/>
+        <w:tblW w:w="0" w:type="auto"/>
+        <w:tblLook w:val="04A0" w:firstRow="1" w:lastRow="0" w:firstColumn="1" w:lastColumn="0" w:noHBand="0" w:noVBand="1"/>
+      </w:tblPr>
+      <w:tblGrid>
+        <w:gridCol w:w="8856"/>
+      </w:tblGrid>
+      <w:tr>
+        <w:tc>
+          <w:tcPr>
+            <w:tcW w:w="8856" w:type="dxa"/>
+          </w:tcPr>
+          <w:p>
+            <w:r>
+              <w:t>{</w:t>
+            </w:r>
+            <w:r>
+              <w:br/>
+              <w:t xml:space="preserve">  "workOrderId":"WO-1001",</w:t>
+            </w:r>
+            <w:r>
+              <w:br/>
+              <w:t xml:space="preserve">  "revisionId":"P100-REV-B",</w:t>
+            </w:r>
+            <w:r>
+              <w:br/>
+              <w:t xml:space="preserve">  "</w:t>
+            </w:r>
+            <w:proofErr w:type="spellStart"/>
+            <w:r>
+              <w:t>status":"RELEASED</w:t>
+            </w:r>
+            <w:proofErr w:type="spellEnd"/>
+            <w:r>
+              <w:t>",</w:t>
+            </w:r>
+            <w:r>
+              <w:br/>
+              <w:t xml:space="preserve">  "remainingQty":50,</w:t>
+            </w:r>
+            <w:r>
+              <w:br/>
+              <w:t xml:space="preserve">  "</w:t>
+            </w:r>
+            <w:proofErr w:type="spellStart"/>
+            <w:r>
+              <w:t>priority":"HIGH</w:t>
+            </w:r>
+            <w:proofErr w:type="spellEnd"/>
+            <w:r>
+              <w:t>",</w:t>
+            </w:r>
+            <w:r>
+              <w:br/>
+              <w:t xml:space="preserve">  "plannedCompletionDate":"2026-02-20",</w:t>
+            </w:r>
+            <w:r>
+              <w:br/>
+            </w:r>
+            <w:r>
+              <w:rPr>
+                <w:b/>
+                <w:bCs/>
+                <w:color w:val="984806" w:themeColor="accent6" w:themeShade="80"/>
+              </w:rPr>
+              <w:t xml:space="preserve">  "operations":[</w:t>
+            </w:r>
+            <w:r>
+              <w:br/>
+              <w:t xml:space="preserve">    {</w:t>
+            </w:r>
+            <w:r>
+              <w:br/>
+              <w:t xml:space="preserve">      "</w:t>
+            </w:r>
+            <w:proofErr w:type="spellStart"/>
+            <w:r>
+              <w:rPr>
+                <w:sz w:val="24"/>
+                <w:szCs w:val="24"/>
+              </w:rPr>
+              <w:t>operation</w:t>
+            </w:r>
+            <w:r>
+              <w:rPr>
+                <w:sz w:val="24"/>
+                <w:szCs w:val="24"/>
+              </w:rPr>
+              <w:t>Sequence</w:t>
+            </w:r>
+            <w:proofErr w:type="spellEnd"/>
+            <w:r>
+              <w:t xml:space="preserve"> ":10,</w:t>
+            </w:r>
+            <w:r>
+              <w:br/>
+              <w:t xml:space="preserve">      "</w:t>
+            </w:r>
+            <w:r>
+              <w:rPr>
+                <w:sz w:val="24"/>
+                <w:szCs w:val="24"/>
+              </w:rPr>
+              <w:t>operationId</w:t>
+            </w:r>
+            <w:r>
+              <w:t>":10,</w:t>
+            </w:r>
+            <w:r>
+              <w:br/>
+              <w:t xml:space="preserve">      "</w:t>
+            </w:r>
+            <w:proofErr w:type="spellStart"/>
+            <w:r>
+              <w:t>name":"SMT</w:t>
+            </w:r>
+            <w:proofErr w:type="spellEnd"/>
+            <w:r>
+              <w:t xml:space="preserve"> Assembly",</w:t>
+            </w:r>
+            <w:r>
+              <w:br/>
+              <w:t xml:space="preserve">      "</w:t>
+            </w:r>
+            <w:proofErr w:type="spellStart"/>
+            <w:r>
+              <w:t>status":"NOT_STARTED</w:t>
+            </w:r>
+            <w:proofErr w:type="spellEnd"/>
+            <w:r>
+              <w:t>",</w:t>
+            </w:r>
+            <w:r>
+              <w:br/>
+              <w:t xml:space="preserve">      "</w:t>
+            </w:r>
+            <w:proofErr w:type="spellStart"/>
+            <w:r>
+              <w:t>workCenterId</w:t>
+            </w:r>
+            <w:proofErr w:type="spellEnd"/>
+            <w:r>
+              <w:t xml:space="preserve"> ":"WC-SMT"</w:t>
+            </w:r>
+            <w:r>
+              <w:br/>
+              <w:t xml:space="preserve">    },</w:t>
+            </w:r>
+            <w:r>
+              <w:br/>
+            </w:r>
+            <w:r>
+              <w:rPr>
+                <w:b/>
+                <w:bCs/>
+                <w:color w:val="984806" w:themeColor="accent6" w:themeShade="80"/>
+              </w:rPr>
+              <w:t xml:space="preserve">    {</w:t>
+            </w:r>
+            <w:r>
+              <w:rPr>
+                <w:b/>
+                <w:bCs/>
+                <w:color w:val="984806" w:themeColor="accent6" w:themeShade="80"/>
+              </w:rPr>
+              <w:br/>
+              <w:t xml:space="preserve">      "</w:t>
+            </w:r>
+            <w:proofErr w:type="spellStart"/>
+            <w:r>
+              <w:rPr>
+                <w:b/>
+                <w:bCs/>
+                <w:color w:val="984806" w:themeColor="accent6" w:themeShade="80"/>
+                <w:sz w:val="24"/>
+                <w:szCs w:val="24"/>
+              </w:rPr>
+              <w:t>operationSequence</w:t>
+            </w:r>
+            <w:proofErr w:type="spellEnd"/>
+            <w:r>
+              <w:rPr>
+                <w:b/>
+                <w:bCs/>
+                <w:color w:val="984806" w:themeColor="accent6" w:themeShade="80"/>
+              </w:rPr>
+              <w:t xml:space="preserve"> ":20,</w:t>
+            </w:r>
+            <w:r>
+              <w:rPr>
+                <w:b/>
+                <w:bCs/>
+                <w:color w:val="984806" w:themeColor="accent6" w:themeShade="80"/>
+              </w:rPr>
+              <w:br/>
+              <w:t xml:space="preserve">      "</w:t>
+            </w:r>
+            <w:r>
+              <w:rPr>
+                <w:b/>
+                <w:bCs/>
+                <w:color w:val="984806" w:themeColor="accent6" w:themeShade="80"/>
+                <w:sz w:val="24"/>
+                <w:szCs w:val="24"/>
+              </w:rPr>
+              <w:t>operationId</w:t>
+            </w:r>
+            <w:r>
+              <w:rPr>
+                <w:b/>
+                <w:bCs/>
+                <w:color w:val="984806" w:themeColor="accent6" w:themeShade="80"/>
+              </w:rPr>
+              <w:t>":20,</w:t>
+            </w:r>
+            <w:r>
+              <w:rPr>
+                <w:b/>
+                <w:bCs/>
+                <w:color w:val="984806" w:themeColor="accent6" w:themeShade="80"/>
+              </w:rPr>
+              <w:br/>
+              <w:t xml:space="preserve">      "</w:t>
+            </w:r>
+            <w:proofErr w:type="spellStart"/>
+            <w:r>
+              <w:rPr>
+                <w:b/>
+                <w:bCs/>
+                <w:color w:val="984806" w:themeColor="accent6" w:themeShade="80"/>
+              </w:rPr>
+              <w:t>name":"AOI</w:t>
+            </w:r>
+            <w:proofErr w:type="spellEnd"/>
+            <w:r>
+              <w:rPr>
+                <w:b/>
+                <w:bCs/>
+                <w:color w:val="984806" w:themeColor="accent6" w:themeShade="80"/>
+              </w:rPr>
+              <w:t xml:space="preserve"> Inspection",</w:t>
+            </w:r>
+            <w:r>
+              <w:rPr>
+                <w:b/>
+                <w:bCs/>
+                <w:color w:val="984806" w:themeColor="accent6" w:themeShade="80"/>
+              </w:rPr>
+              <w:br/>
+              <w:t xml:space="preserve">      "</w:t>
+            </w:r>
+            <w:proofErr w:type="spellStart"/>
+            <w:r>
+              <w:rPr>
+                <w:b/>
+                <w:bCs/>
+                <w:color w:val="984806" w:themeColor="accent6" w:themeShade="80"/>
+              </w:rPr>
+              <w:t>status":"NOT_STARTED</w:t>
+            </w:r>
+            <w:proofErr w:type="spellEnd"/>
+            <w:r>
+              <w:rPr>
+                <w:b/>
+                <w:bCs/>
+                <w:color w:val="984806" w:themeColor="accent6" w:themeShade="80"/>
+              </w:rPr>
+              <w:t>",</w:t>
+            </w:r>
+            <w:r>
+              <w:rPr>
+                <w:b/>
+                <w:bCs/>
+                <w:color w:val="984806" w:themeColor="accent6" w:themeShade="80"/>
+              </w:rPr>
+              <w:br/>
+              <w:t xml:space="preserve">      "</w:t>
+            </w:r>
+            <w:proofErr w:type="spellStart"/>
+            <w:r>
+              <w:rPr>
+                <w:b/>
+                <w:bCs/>
+                <w:color w:val="984806" w:themeColor="accent6" w:themeShade="80"/>
+              </w:rPr>
+              <w:t>workCenterId</w:t>
+            </w:r>
+            <w:proofErr w:type="spellEnd"/>
+            <w:r>
+              <w:rPr>
+                <w:b/>
+                <w:bCs/>
+                <w:color w:val="984806" w:themeColor="accent6" w:themeShade="80"/>
+              </w:rPr>
+              <w:t xml:space="preserve"> ":"WC-AOI"</w:t>
+            </w:r>
+            <w:r>
+              <w:rPr>
+                <w:b/>
+                <w:bCs/>
+                <w:color w:val="984806" w:themeColor="accent6" w:themeShade="80"/>
+              </w:rPr>
+              <w:br/>
+              <w:t xml:space="preserve">    }</w:t>
+            </w:r>
+            <w:r>
+              <w:br/>
+              <w:t xml:space="preserve">  ]</w:t>
+            </w:r>
+            <w:r>
+              <w:br/>
+              <w:t>}</w:t>
+            </w:r>
+          </w:p>
+        </w:tc>
+      </w:tr>
+    </w:tbl>
+    <w:p/>
     <w:p>
       <w:pPr>
         <w:pStyle w:val="Heading2"/>
       </w:pPr>
       <w:r>
-        <w:t>8. Equipment Impact Analysis</w:t>
+        <w:t xml:space="preserve">8. </w:t>
+      </w:r>
+      <w:r>
+        <w:t>Work Cent</w:t>
+      </w:r>
+      <w:r>
+        <w:t>er</w:t>
+      </w:r>
+      <w:r>
+        <w:t xml:space="preserve"> Impact Analysis</w:t>
+      </w:r>
+    </w:p>
+    <w:p>
+      <w:pPr>
+        <w:rPr>
+          <w:sz w:val="24"/>
+          <w:szCs w:val="24"/>
+          <w:lang w:val="en-IN"/>
+        </w:rPr>
+      </w:pPr>
+      <w:r>
+        <w:rPr>
+          <w:b/>
+          <w:bCs/>
+          <w:sz w:val="24"/>
+          <w:szCs w:val="24"/>
+          <w:lang w:val="en-IN"/>
+        </w:rPr>
+        <w:t xml:space="preserve">Work </w:t>
+      </w:r>
+      <w:proofErr w:type="spellStart"/>
+      <w:r>
+        <w:rPr>
+          <w:b/>
+          <w:bCs/>
+          <w:sz w:val="24"/>
+          <w:szCs w:val="24"/>
+          <w:lang w:val="en-IN"/>
+        </w:rPr>
+        <w:t>Cent</w:t>
+      </w:r>
+      <w:r>
+        <w:rPr>
+          <w:b/>
+          <w:bCs/>
+          <w:sz w:val="24"/>
+          <w:szCs w:val="24"/>
+          <w:lang w:val="en-IN"/>
+        </w:rPr>
+        <w:t>er</w:t>
+      </w:r>
+      <w:proofErr w:type="spellEnd"/>
+      <w:r>
+        <w:rPr>
+          <w:b/>
+          <w:bCs/>
+          <w:sz w:val="24"/>
+          <w:szCs w:val="24"/>
+          <w:lang w:val="en-IN"/>
+        </w:rPr>
+        <w:t xml:space="preserve"> Impact Analysis</w:t>
+      </w:r>
+      <w:r>
+        <w:rPr>
+          <w:sz w:val="24"/>
+          <w:szCs w:val="24"/>
+          <w:lang w:val="en-IN"/>
+        </w:rPr>
+        <w:t xml:space="preserve"> extends the Manufacturing Impact Analysis Engine (MIAE) beyond product and supply chain dependencies into manufacturing execution by introducing </w:t>
+      </w:r>
+      <w:r>
+        <w:rPr>
+          <w:b/>
+          <w:bCs/>
+          <w:sz w:val="24"/>
+          <w:szCs w:val="24"/>
+          <w:lang w:val="en-IN"/>
+        </w:rPr>
+        <w:t xml:space="preserve">Work </w:t>
+      </w:r>
+      <w:proofErr w:type="spellStart"/>
+      <w:r>
+        <w:rPr>
+          <w:b/>
+          <w:bCs/>
+          <w:sz w:val="24"/>
+          <w:szCs w:val="24"/>
+          <w:lang w:val="en-IN"/>
+        </w:rPr>
+        <w:t>Cent</w:t>
+      </w:r>
+      <w:r>
+        <w:rPr>
+          <w:b/>
+          <w:bCs/>
+          <w:sz w:val="24"/>
+          <w:szCs w:val="24"/>
+          <w:lang w:val="en-IN"/>
+        </w:rPr>
+        <w:t>er</w:t>
+      </w:r>
+      <w:proofErr w:type="spellEnd"/>
+      <w:r>
+        <w:rPr>
+          <w:b/>
+          <w:bCs/>
+          <w:sz w:val="24"/>
+          <w:szCs w:val="24"/>
+          <w:lang w:val="en-IN"/>
+        </w:rPr>
+        <w:t xml:space="preserve"> </w:t>
+      </w:r>
+      <w:r>
+        <w:rPr>
+          <w:sz w:val="24"/>
+          <w:szCs w:val="24"/>
+          <w:lang w:val="en-IN"/>
+        </w:rPr>
+        <w:t xml:space="preserve">as the primary execution resource. A Work </w:t>
+      </w:r>
+      <w:proofErr w:type="spellStart"/>
+      <w:r>
+        <w:rPr>
+          <w:sz w:val="24"/>
+          <w:szCs w:val="24"/>
+          <w:lang w:val="en-IN"/>
+        </w:rPr>
+        <w:t>Cent</w:t>
+      </w:r>
+      <w:r>
+        <w:rPr>
+          <w:sz w:val="24"/>
+          <w:szCs w:val="24"/>
+          <w:lang w:val="en-IN"/>
+        </w:rPr>
+        <w:t>er</w:t>
+      </w:r>
+      <w:proofErr w:type="spellEnd"/>
+      <w:r>
+        <w:rPr>
+          <w:sz w:val="24"/>
+          <w:szCs w:val="24"/>
+          <w:lang w:val="en-IN"/>
+        </w:rPr>
+        <w:t xml:space="preserve"> represents the lowest logical manufacturing resource used by ERP systems for production planning and operation routing. Manufacturing Operations are scheduled to execute at a Work </w:t>
+      </w:r>
+      <w:proofErr w:type="spellStart"/>
+      <w:r>
+        <w:rPr>
+          <w:sz w:val="24"/>
+          <w:szCs w:val="24"/>
+          <w:lang w:val="en-IN"/>
+        </w:rPr>
+        <w:t>Cent</w:t>
+      </w:r>
+      <w:r>
+        <w:rPr>
+          <w:sz w:val="24"/>
+          <w:szCs w:val="24"/>
+          <w:lang w:val="en-IN"/>
+        </w:rPr>
+        <w:t>er</w:t>
+      </w:r>
+      <w:proofErr w:type="spellEnd"/>
+      <w:r>
+        <w:rPr>
+          <w:sz w:val="24"/>
+          <w:szCs w:val="24"/>
+          <w:lang w:val="en-IN"/>
+        </w:rPr>
+        <w:t xml:space="preserve">, making it the natural point for </w:t>
+      </w:r>
+      <w:r>
+        <w:rPr>
+          <w:sz w:val="24"/>
+          <w:szCs w:val="24"/>
+          <w:lang w:val="en-IN"/>
+        </w:rPr>
+        <w:t>analysing</w:t>
+      </w:r>
+      <w:r>
+        <w:rPr>
+          <w:sz w:val="24"/>
+          <w:szCs w:val="24"/>
+          <w:lang w:val="en-IN"/>
+        </w:rPr>
+        <w:t xml:space="preserve"> the business impact of execution resource availability.</w:t>
+      </w:r>
+    </w:p>
+    <w:p>
+      <w:pPr>
+        <w:rPr>
+          <w:sz w:val="24"/>
+          <w:szCs w:val="24"/>
+          <w:lang w:val="en-IN"/>
+        </w:rPr>
+      </w:pPr>
+      <w:r>
+        <w:rPr>
+          <w:sz w:val="24"/>
+          <w:szCs w:val="24"/>
+          <w:lang w:val="en-IN"/>
+        </w:rPr>
+        <w:t xml:space="preserve">This capability enables MIAE to determine the business impact of Work </w:t>
+      </w:r>
+      <w:proofErr w:type="spellStart"/>
+      <w:r>
+        <w:rPr>
+          <w:sz w:val="24"/>
+          <w:szCs w:val="24"/>
+          <w:lang w:val="en-IN"/>
+        </w:rPr>
+        <w:t>Cent</w:t>
+      </w:r>
+      <w:r>
+        <w:rPr>
+          <w:sz w:val="24"/>
+          <w:szCs w:val="24"/>
+          <w:lang w:val="en-IN"/>
+        </w:rPr>
+        <w:t>er</w:t>
+      </w:r>
+      <w:proofErr w:type="spellEnd"/>
+      <w:r>
+        <w:rPr>
+          <w:sz w:val="24"/>
+          <w:szCs w:val="24"/>
+          <w:lang w:val="en-IN"/>
+        </w:rPr>
+        <w:t xml:space="preserve"> unavailability by traversing the manufacturing execution graph from </w:t>
+      </w:r>
+      <w:r>
+        <w:rPr>
+          <w:b/>
+          <w:bCs/>
+          <w:sz w:val="24"/>
+          <w:szCs w:val="24"/>
+          <w:lang w:val="en-IN"/>
+        </w:rPr>
+        <w:t xml:space="preserve">Work </w:t>
+      </w:r>
+      <w:proofErr w:type="spellStart"/>
+      <w:r>
+        <w:rPr>
+          <w:b/>
+          <w:bCs/>
+          <w:sz w:val="24"/>
+          <w:szCs w:val="24"/>
+          <w:lang w:val="en-IN"/>
+        </w:rPr>
+        <w:t>Cent</w:t>
+      </w:r>
+      <w:r>
+        <w:rPr>
+          <w:b/>
+          <w:bCs/>
+          <w:sz w:val="24"/>
+          <w:szCs w:val="24"/>
+          <w:lang w:val="en-IN"/>
+        </w:rPr>
+        <w:t>er</w:t>
+      </w:r>
+      <w:proofErr w:type="spellEnd"/>
+      <w:r>
+        <w:rPr>
+          <w:b/>
+          <w:bCs/>
+          <w:sz w:val="24"/>
+          <w:szCs w:val="24"/>
+          <w:lang w:val="en-IN"/>
+        </w:rPr>
+        <w:t xml:space="preserve"> → Operation → Work Order → Product → Sales Order → Customer</w:t>
+      </w:r>
+      <w:r>
+        <w:rPr>
+          <w:sz w:val="24"/>
+          <w:szCs w:val="24"/>
+          <w:lang w:val="en-IN"/>
+        </w:rPr>
+        <w:t xml:space="preserve">. </w:t>
+      </w:r>
+    </w:p>
+    <w:p>
+      <w:pPr>
+        <w:rPr>
+          <w:sz w:val="24"/>
+          <w:szCs w:val="24"/>
+          <w:lang w:val="en-IN"/>
+        </w:rPr>
+      </w:pPr>
+      <w:r>
+        <w:rPr>
+          <w:sz w:val="24"/>
+          <w:szCs w:val="24"/>
+          <w:lang w:val="en-IN"/>
+        </w:rPr>
+        <w:lastRenderedPageBreak/>
+        <w:t xml:space="preserve">Business users can identify which Work Orders are scheduled to execute at a specific Work </w:t>
+      </w:r>
+      <w:proofErr w:type="spellStart"/>
+      <w:r>
+        <w:rPr>
+          <w:sz w:val="24"/>
+          <w:szCs w:val="24"/>
+          <w:lang w:val="en-IN"/>
+        </w:rPr>
+        <w:t>Cent</w:t>
+      </w:r>
+      <w:r>
+        <w:rPr>
+          <w:sz w:val="24"/>
+          <w:szCs w:val="24"/>
+          <w:lang w:val="en-IN"/>
+        </w:rPr>
+        <w:t>er</w:t>
+      </w:r>
+      <w:proofErr w:type="spellEnd"/>
+      <w:r>
+        <w:rPr>
+          <w:sz w:val="24"/>
+          <w:szCs w:val="24"/>
+          <w:lang w:val="en-IN"/>
+        </w:rPr>
+        <w:t xml:space="preserve">, which Products and Customers depend on its availability, and assess the operational impact of capacity constraints, planned maintenance, or production disruptions. </w:t>
+      </w:r>
+      <w:r>
+        <w:rPr>
+          <w:b/>
+          <w:bCs/>
+          <w:sz w:val="24"/>
+          <w:szCs w:val="24"/>
+          <w:lang w:val="en-IN"/>
+        </w:rPr>
+        <w:t xml:space="preserve">Work </w:t>
+      </w:r>
+      <w:proofErr w:type="spellStart"/>
+      <w:r>
+        <w:rPr>
+          <w:b/>
+          <w:bCs/>
+          <w:sz w:val="24"/>
+          <w:szCs w:val="24"/>
+          <w:lang w:val="en-IN"/>
+        </w:rPr>
+        <w:t>Cent</w:t>
+      </w:r>
+      <w:r>
+        <w:rPr>
+          <w:b/>
+          <w:bCs/>
+          <w:sz w:val="24"/>
+          <w:szCs w:val="24"/>
+          <w:lang w:val="en-IN"/>
+        </w:rPr>
+        <w:t>er</w:t>
+      </w:r>
+      <w:proofErr w:type="spellEnd"/>
+      <w:r>
+        <w:rPr>
+          <w:b/>
+          <w:bCs/>
+          <w:sz w:val="24"/>
+          <w:szCs w:val="24"/>
+          <w:lang w:val="en-IN"/>
+        </w:rPr>
+        <w:t xml:space="preserve"> Impact Analysis is the baseline capability of Manufacturing Execution Impact Analysis and is available for all ERP integrations.</w:t>
+      </w:r>
+    </w:p>
+    <w:p>
+      <w:pPr>
+        <w:pStyle w:val="Heading3"/>
+      </w:pPr>
+      <w:r>
+        <w:t xml:space="preserve">8.1 </w:t>
+      </w:r>
+      <w:r>
+        <w:t>Request Payload:</w:t>
+      </w:r>
+    </w:p>
+    <w:p>
+      <w:pPr>
+        <w:rPr>
+          <w:i/>
+          <w:iCs/>
+        </w:rPr>
+      </w:pPr>
+      <w:r>
+        <w:rPr>
+          <w:b/>
+          <w:bCs/>
+          <w:i/>
+          <w:iCs/>
+        </w:rPr>
+        <w:t>POST</w:t>
+      </w:r>
+      <w:r>
+        <w:rPr>
+          <w:i/>
+          <w:iCs/>
+        </w:rPr>
+        <w:t xml:space="preserve"> /</w:t>
+      </w:r>
+      <w:proofErr w:type="spellStart"/>
+      <w:r>
+        <w:rPr>
+          <w:i/>
+          <w:iCs/>
+        </w:rPr>
+        <w:t>api</w:t>
+      </w:r>
+      <w:proofErr w:type="spellEnd"/>
+      <w:r>
+        <w:rPr>
+          <w:i/>
+          <w:iCs/>
+        </w:rPr>
+        <w:t>/v1/impact-analysis</w:t>
+      </w:r>
+      <w:r>
+        <w:rPr>
+          <w:i/>
+          <w:iCs/>
+        </w:rPr>
+        <w:br/>
+      </w:r>
+      <w:r>
+        <w:rPr>
+          <w:b/>
+          <w:bCs/>
+          <w:i/>
+          <w:iCs/>
+        </w:rPr>
+        <w:t>Content-Type</w:t>
+      </w:r>
+      <w:r>
+        <w:rPr>
+          <w:i/>
+          <w:iCs/>
+        </w:rPr>
+        <w:t>: application/</w:t>
+      </w:r>
+      <w:proofErr w:type="spellStart"/>
+      <w:r>
+        <w:rPr>
+          <w:i/>
+          <w:iCs/>
+        </w:rPr>
+        <w:t>json</w:t>
+      </w:r>
+      <w:proofErr w:type="spellEnd"/>
+    </w:p>
+    <w:p>
+      <w:r>
+        <w:t>{</w:t>
+      </w:r>
+      <w:r>
+        <w:br/>
+      </w:r>
+      <w:r>
+        <w:t xml:space="preserve"> </w:t>
+      </w:r>
+      <w:r>
+        <w:t>"</w:t>
+      </w:r>
+      <w:proofErr w:type="spellStart"/>
+      <w:r>
+        <w:t>entityType</w:t>
+      </w:r>
+      <w:proofErr w:type="spellEnd"/>
+      <w:r>
+        <w:t>": "WORK_CENTER",</w:t>
+      </w:r>
+      <w:r>
+        <w:br/>
+      </w:r>
+      <w:r>
+        <w:t xml:space="preserve"> </w:t>
+      </w:r>
+      <w:r>
+        <w:t>"</w:t>
+      </w:r>
+      <w:proofErr w:type="spellStart"/>
+      <w:r>
+        <w:t>entityId</w:t>
+      </w:r>
+      <w:proofErr w:type="spellEnd"/>
+      <w:r>
+        <w:t>": "WC-SMT-01"</w:t>
+      </w:r>
+      <w:r>
+        <w:br/>
+        <w:t>}</w:t>
+      </w:r>
+    </w:p>
+    <w:p>
+      <w:pPr>
+        <w:pStyle w:val="Heading3"/>
+      </w:pPr>
+      <w:r>
+        <w:t xml:space="preserve">8.2 </w:t>
+      </w:r>
+      <w:r>
+        <w:t>Re</w:t>
+      </w:r>
+      <w:r>
+        <w:t>sponse</w:t>
+      </w:r>
+      <w:r>
+        <w:t xml:space="preserve"> Payload:</w:t>
+      </w:r>
+    </w:p>
+    <w:tbl>
+      <w:tblPr>
+        <w:tblStyle w:val="TableGrid"/>
+        <w:tblW w:w="0" w:type="auto"/>
+        <w:tblInd w:w="108" w:type="dxa"/>
+        <w:tblLook w:val="04A0" w:firstRow="1" w:lastRow="0" w:firstColumn="1" w:lastColumn="0" w:noHBand="0" w:noVBand="1"/>
+      </w:tblPr>
+      <w:tblGrid>
+        <w:gridCol w:w="8748"/>
+      </w:tblGrid>
+      <w:tr>
+        <w:tc>
+          <w:tcPr>
+            <w:tcW w:w="8748" w:type="dxa"/>
+          </w:tcPr>
+          <w:p>
+            <w:r>
+              <w:t>{</w:t>
+            </w:r>
+          </w:p>
+          <w:p>
+            <w:r>
+              <w:t xml:space="preserve">  "</w:t>
+            </w:r>
+            <w:proofErr w:type="spellStart"/>
+            <w:r>
+              <w:t>entityType</w:t>
+            </w:r>
+            <w:proofErr w:type="spellEnd"/>
+            <w:r>
+              <w:t>": "WORK_CENTER",</w:t>
+            </w:r>
+          </w:p>
+          <w:p>
+            <w:r>
+              <w:t xml:space="preserve">  "</w:t>
+            </w:r>
+            <w:proofErr w:type="spellStart"/>
+            <w:r>
+              <w:t>entityId</w:t>
+            </w:r>
+            <w:proofErr w:type="spellEnd"/>
+            <w:r>
+              <w:t>": "WC-100",</w:t>
+            </w:r>
+          </w:p>
+          <w:p>
+            <w:r>
+              <w:t xml:space="preserve">  "</w:t>
+            </w:r>
+            <w:proofErr w:type="spellStart"/>
+            <w:r>
+              <w:t>entityName</w:t>
+            </w:r>
+            <w:proofErr w:type="spellEnd"/>
+            <w:r>
+              <w:t>": "SMT Assembly",</w:t>
+            </w:r>
+          </w:p>
+          <w:p/>
+          <w:p>
+            <w:r>
+              <w:t xml:space="preserve">  "summary": {</w:t>
+            </w:r>
+          </w:p>
+          <w:p>
+            <w:r>
+              <w:t xml:space="preserve">    "</w:t>
+            </w:r>
+            <w:proofErr w:type="spellStart"/>
+            <w:r>
+              <w:t>affectedOperations</w:t>
+            </w:r>
+            <w:proofErr w:type="spellEnd"/>
+            <w:r>
+              <w:t>": 8,</w:t>
+            </w:r>
+          </w:p>
+          <w:p>
+            <w:r>
+              <w:t xml:space="preserve">    "</w:t>
+            </w:r>
+            <w:proofErr w:type="spellStart"/>
+            <w:r>
+              <w:t>affectedWorkOrders</w:t>
+            </w:r>
+            <w:proofErr w:type="spellEnd"/>
+            <w:r>
+              <w:t>": 12,</w:t>
+            </w:r>
+          </w:p>
+          <w:p>
+            <w:r>
+              <w:t xml:space="preserve">    "</w:t>
+            </w:r>
+            <w:proofErr w:type="spellStart"/>
+            <w:r>
+              <w:t>affectedProducts</w:t>
+            </w:r>
+            <w:proofErr w:type="spellEnd"/>
+            <w:r>
+              <w:t>": 5,</w:t>
+            </w:r>
+          </w:p>
+          <w:p>
+            <w:r>
+              <w:t xml:space="preserve">    "</w:t>
+            </w:r>
+            <w:proofErr w:type="spellStart"/>
+            <w:r>
+              <w:t>affectedSalesOrders</w:t>
+            </w:r>
+            <w:proofErr w:type="spellEnd"/>
+            <w:r>
+              <w:t>": 18,</w:t>
+            </w:r>
+          </w:p>
+          <w:p>
+            <w:r>
+              <w:t xml:space="preserve">    "</w:t>
+            </w:r>
+            <w:proofErr w:type="spellStart"/>
+            <w:r>
+              <w:t>affectedCustomers</w:t>
+            </w:r>
+            <w:proofErr w:type="spellEnd"/>
+            <w:r>
+              <w:t>": 7,</w:t>
+            </w:r>
+          </w:p>
+          <w:p>
+            <w:r>
+              <w:t xml:space="preserve">    "</w:t>
+            </w:r>
+            <w:proofErr w:type="spellStart"/>
+            <w:r>
+              <w:t>revenueAtRisk</w:t>
+            </w:r>
+            <w:proofErr w:type="spellEnd"/>
+            <w:r>
+              <w:t>": 1250000</w:t>
+            </w:r>
+          </w:p>
+          <w:p>
+            <w:r>
+              <w:t xml:space="preserve">  },</w:t>
+            </w:r>
+          </w:p>
+          <w:p/>
+          <w:p>
+            <w:r>
+              <w:t xml:space="preserve">  "operations": [</w:t>
+            </w:r>
+          </w:p>
+          <w:p>
+            <w:r>
+              <w:t xml:space="preserve">    {</w:t>
+            </w:r>
+          </w:p>
+          <w:p>
+            <w:r>
+              <w:t xml:space="preserve">      "</w:t>
+            </w:r>
+            <w:proofErr w:type="spellStart"/>
+            <w:r>
+              <w:t>operationNumber</w:t>
+            </w:r>
+            <w:proofErr w:type="spellEnd"/>
+            <w:r>
+              <w:t>": 10,</w:t>
+            </w:r>
+          </w:p>
+          <w:p>
+            <w:r>
+              <w:t xml:space="preserve">      "name": "SMT Assembly",</w:t>
+            </w:r>
+          </w:p>
+          <w:p>
+            <w:r>
+              <w:t xml:space="preserve">      "status": "NOT_STARTED"</w:t>
+            </w:r>
+          </w:p>
+          <w:p>
+            <w:r>
+              <w:t xml:space="preserve">    },</w:t>
+            </w:r>
+          </w:p>
+          <w:p>
+            <w:r>
+              <w:t xml:space="preserve">    {</w:t>
+            </w:r>
+          </w:p>
+          <w:p>
+            <w:r>
+              <w:t xml:space="preserve">      "</w:t>
+            </w:r>
+            <w:proofErr w:type="spellStart"/>
+            <w:r>
+              <w:t>operationNumber</w:t>
+            </w:r>
+            <w:proofErr w:type="spellEnd"/>
+            <w:r>
+              <w:t>": 20,</w:t>
+            </w:r>
+          </w:p>
+          <w:p>
+            <w:r>
+              <w:t xml:space="preserve">      "name": "AOI Inspection",</w:t>
+            </w:r>
+          </w:p>
+          <w:p>
+            <w:r>
+              <w:t xml:space="preserve">      "status": "IN_PROGRESS"</w:t>
+            </w:r>
+          </w:p>
+          <w:p>
+            <w:r>
+              <w:t xml:space="preserve">    }</w:t>
+            </w:r>
+          </w:p>
+          <w:p>
+            <w:r>
+              <w:t xml:space="preserve">  ],</w:t>
+            </w:r>
+          </w:p>
+          <w:p/>
+          <w:p>
+            <w:r>
+              <w:t xml:space="preserve">  "</w:t>
+            </w:r>
+            <w:proofErr w:type="spellStart"/>
+            <w:r>
+              <w:t>affectedWorkOrders</w:t>
+            </w:r>
+            <w:proofErr w:type="spellEnd"/>
+            <w:r>
+              <w:t>": [</w:t>
+            </w:r>
+          </w:p>
+          <w:p>
+            <w:r>
+              <w:t xml:space="preserve">    {</w:t>
+            </w:r>
+          </w:p>
+          <w:p>
+            <w:r>
+              <w:t xml:space="preserve">      "</w:t>
+            </w:r>
+            <w:proofErr w:type="spellStart"/>
+            <w:r>
+              <w:t>workOrderId</w:t>
+            </w:r>
+            <w:proofErr w:type="spellEnd"/>
+            <w:r>
+              <w:t>": "WO-1001",</w:t>
+            </w:r>
+          </w:p>
+          <w:p>
+            <w:r>
+              <w:t xml:space="preserve">      "priority": "HIGH",</w:t>
+            </w:r>
+          </w:p>
+          <w:p>
+            <w:r>
+              <w:lastRenderedPageBreak/>
+              <w:t xml:space="preserve">      "status": "RELEASED",</w:t>
+            </w:r>
+          </w:p>
+          <w:p>
+            <w:r>
+              <w:t xml:space="preserve">      "</w:t>
+            </w:r>
+            <w:proofErr w:type="spellStart"/>
+            <w:r>
+              <w:t>remainingQty</w:t>
+            </w:r>
+            <w:proofErr w:type="spellEnd"/>
+            <w:r>
+              <w:t>": 50</w:t>
+            </w:r>
+          </w:p>
+          <w:p>
+            <w:r>
+              <w:t xml:space="preserve">    },</w:t>
+            </w:r>
+          </w:p>
+          <w:p>
+            <w:r>
+              <w:t xml:space="preserve">    {</w:t>
+            </w:r>
+          </w:p>
+          <w:p>
+            <w:r>
+              <w:t xml:space="preserve">      "</w:t>
+            </w:r>
+            <w:proofErr w:type="spellStart"/>
+            <w:r>
+              <w:t>workOrderId</w:t>
+            </w:r>
+            <w:proofErr w:type="spellEnd"/>
+            <w:r>
+              <w:t>": "WO-1005",</w:t>
+            </w:r>
+          </w:p>
+          <w:p>
+            <w:r>
+              <w:t xml:space="preserve">      "priority": "MEDIUM",</w:t>
+            </w:r>
+          </w:p>
+          <w:p>
+            <w:r>
+              <w:t xml:space="preserve">      "status": "IN_PROGRESS",</w:t>
+            </w:r>
+          </w:p>
+          <w:p>
+            <w:r>
+              <w:t xml:space="preserve">      "</w:t>
+            </w:r>
+            <w:proofErr w:type="spellStart"/>
+            <w:r>
+              <w:t>remainingQty</w:t>
+            </w:r>
+            <w:proofErr w:type="spellEnd"/>
+            <w:r>
+              <w:t>": 120</w:t>
+            </w:r>
+          </w:p>
+          <w:p>
+            <w:r>
+              <w:t xml:space="preserve">    }</w:t>
+            </w:r>
+          </w:p>
+          <w:p>
+            <w:r>
+              <w:t xml:space="preserve">  ],</w:t>
+            </w:r>
+          </w:p>
+          <w:p/>
+          <w:p>
+            <w:r>
+              <w:t xml:space="preserve">  "</w:t>
+            </w:r>
+            <w:proofErr w:type="spellStart"/>
+            <w:r>
+              <w:t>affectedProducts</w:t>
+            </w:r>
+            <w:proofErr w:type="spellEnd"/>
+            <w:r>
+              <w:t>": [</w:t>
+            </w:r>
+          </w:p>
+          <w:p>
+            <w:r>
+              <w:t xml:space="preserve">    {</w:t>
+            </w:r>
+          </w:p>
+          <w:p>
+            <w:r>
+              <w:t xml:space="preserve">      "</w:t>
+            </w:r>
+            <w:proofErr w:type="spellStart"/>
+            <w:r>
+              <w:t>productId</w:t>
+            </w:r>
+            <w:proofErr w:type="spellEnd"/>
+            <w:r>
+              <w:t>": "P100",</w:t>
+            </w:r>
+          </w:p>
+          <w:p>
+            <w:r>
+              <w:t xml:space="preserve">      "code": "SENSOR-100",</w:t>
+            </w:r>
+          </w:p>
+          <w:p>
+            <w:r>
+              <w:t xml:space="preserve">      "name": "Industrial Sensor"</w:t>
+            </w:r>
+          </w:p>
+          <w:p>
+            <w:r>
+              <w:t xml:space="preserve">    },</w:t>
+            </w:r>
+          </w:p>
+          <w:p>
+            <w:r>
+              <w:t xml:space="preserve">    {</w:t>
+            </w:r>
+          </w:p>
+          <w:p>
+            <w:r>
+              <w:t xml:space="preserve">      "</w:t>
+            </w:r>
+            <w:proofErr w:type="spellStart"/>
+            <w:r>
+              <w:t>productId</w:t>
+            </w:r>
+            <w:proofErr w:type="spellEnd"/>
+            <w:r>
+              <w:t>": "P200",</w:t>
+            </w:r>
+          </w:p>
+          <w:p>
+            <w:r>
+              <w:t xml:space="preserve">      "code": "CTRL-200",</w:t>
+            </w:r>
+          </w:p>
+          <w:p>
+            <w:r>
+              <w:t xml:space="preserve">      "name": "Industrial Controller"</w:t>
+            </w:r>
+          </w:p>
+          <w:p>
+            <w:r>
+              <w:t xml:space="preserve">    }</w:t>
+            </w:r>
+          </w:p>
+          <w:p>
+            <w:r>
+              <w:t xml:space="preserve">  ],</w:t>
+            </w:r>
+          </w:p>
+          <w:p/>
+          <w:p>
+            <w:r>
+              <w:t xml:space="preserve">  "</w:t>
+            </w:r>
+            <w:proofErr w:type="spellStart"/>
+            <w:r>
+              <w:t>affectedSalesOrders</w:t>
+            </w:r>
+            <w:proofErr w:type="spellEnd"/>
+            <w:r>
+              <w:t>": [</w:t>
+            </w:r>
+          </w:p>
+          <w:p>
+            <w:r>
+              <w:t xml:space="preserve">    {</w:t>
+            </w:r>
+          </w:p>
+          <w:p>
+            <w:r>
+              <w:t xml:space="preserve">      "</w:t>
+            </w:r>
+            <w:proofErr w:type="spellStart"/>
+            <w:r>
+              <w:t>salesOrderId</w:t>
+            </w:r>
+            <w:proofErr w:type="spellEnd"/>
+            <w:r>
+              <w:t>": "SO-101",</w:t>
+            </w:r>
+          </w:p>
+          <w:p>
+            <w:r>
+              <w:t xml:space="preserve">      "customer": "Acme Manufacturing",</w:t>
+            </w:r>
+          </w:p>
+          <w:p>
+            <w:r>
+              <w:t xml:space="preserve">      "</w:t>
+            </w:r>
+            <w:proofErr w:type="spellStart"/>
+            <w:r>
+              <w:t>orderValue</w:t>
+            </w:r>
+            <w:proofErr w:type="spellEnd"/>
+            <w:r>
+              <w:t>": 450000</w:t>
+            </w:r>
+          </w:p>
+          <w:p>
+            <w:r>
+              <w:t xml:space="preserve">    },</w:t>
+            </w:r>
+          </w:p>
+          <w:p>
+            <w:r>
+              <w:t xml:space="preserve">    {</w:t>
+            </w:r>
+          </w:p>
+          <w:p>
+            <w:r>
+              <w:t xml:space="preserve">      "</w:t>
+            </w:r>
+            <w:proofErr w:type="spellStart"/>
+            <w:r>
+              <w:t>salesOrderId</w:t>
+            </w:r>
+            <w:proofErr w:type="spellEnd"/>
+            <w:r>
+              <w:t>": "SO-102",</w:t>
+            </w:r>
+          </w:p>
+          <w:p>
+            <w:r>
+              <w:t xml:space="preserve">      "customer": "Global Industries",</w:t>
+            </w:r>
+          </w:p>
+          <w:p>
+            <w:r>
+              <w:t xml:space="preserve">      "</w:t>
+            </w:r>
+            <w:proofErr w:type="spellStart"/>
+            <w:r>
+              <w:t>orderValue</w:t>
+            </w:r>
+            <w:proofErr w:type="spellEnd"/>
+            <w:r>
+              <w:t>": 800000</w:t>
+            </w:r>
+          </w:p>
+          <w:p>
+            <w:r>
+              <w:t xml:space="preserve">    }</w:t>
+            </w:r>
+          </w:p>
+          <w:p>
+            <w:r>
+              <w:t xml:space="preserve">  ],</w:t>
+            </w:r>
+          </w:p>
+          <w:p/>
+          <w:p>
+            <w:r>
+              <w:t xml:space="preserve">  "</w:t>
+            </w:r>
+            <w:proofErr w:type="spellStart"/>
+            <w:r>
+              <w:t>affectedCustomers</w:t>
+            </w:r>
+            <w:proofErr w:type="spellEnd"/>
+            <w:r>
+              <w:t>": [</w:t>
+            </w:r>
+          </w:p>
+          <w:p>
+            <w:r>
+              <w:t xml:space="preserve">    {</w:t>
+            </w:r>
+          </w:p>
+          <w:p>
+            <w:r>
+              <w:t xml:space="preserve">      "</w:t>
+            </w:r>
+            <w:proofErr w:type="spellStart"/>
+            <w:r>
+              <w:t>customerId</w:t>
+            </w:r>
+            <w:proofErr w:type="spellEnd"/>
+            <w:r>
+              <w:t>": "CUST-100",</w:t>
+            </w:r>
+          </w:p>
+          <w:p>
+            <w:r>
+              <w:t xml:space="preserve">      "name": "Acme Manufacturing"</w:t>
+            </w:r>
+          </w:p>
+          <w:p>
+            <w:r>
+              <w:t xml:space="preserve">    },</w:t>
+            </w:r>
+          </w:p>
+          <w:p>
+            <w:r>
+              <w:t xml:space="preserve">    {</w:t>
+            </w:r>
+          </w:p>
+          <w:p>
+            <w:r>
+              <w:t xml:space="preserve">      "</w:t>
+            </w:r>
+            <w:proofErr w:type="spellStart"/>
+            <w:r>
+              <w:t>customerId</w:t>
+            </w:r>
+            <w:proofErr w:type="spellEnd"/>
+            <w:r>
+              <w:t>": "CUST-200",</w:t>
+            </w:r>
+          </w:p>
+          <w:p>
+            <w:r>
+              <w:t xml:space="preserve">      "name": "Global Industries"</w:t>
+            </w:r>
+          </w:p>
+          <w:p>
+            <w:r>
+              <w:t xml:space="preserve">    }</w:t>
+            </w:r>
+          </w:p>
+          <w:p>
+            <w:r>
+              <w:t xml:space="preserve">  ]</w:t>
+            </w:r>
+          </w:p>
+          <w:p>
+            <w:r>
+              <w:t>}</w:t>
+            </w:r>
+          </w:p>
+        </w:tc>
+      </w:tr>
+    </w:tbl>
+    <w:p/>
+    <w:p>
+      <w:pPr>
+        <w:pStyle w:val="Heading2"/>
+      </w:pPr>
+      <w:r>
+        <w:lastRenderedPageBreak/>
+        <w:t>9</w:t>
+      </w:r>
+      <w:r>
+        <w:t>. Equipment Impact Analysis</w:t>
       </w:r>
     </w:p>
     <w:p>
@@ -2273,12 +3532,73 @@
       </w:pPr>
       <w:r>
         <w:rPr>
+          <w:sz w:val="24"/>
+          <w:szCs w:val="24"/>
+        </w:rPr>
+        <w:t xml:space="preserve">Equipment Impact Analysis is an </w:t>
+      </w:r>
+      <w:r>
+        <w:rPr>
           <w:b/>
           <w:bCs/>
           <w:sz w:val="24"/>
           <w:szCs w:val="24"/>
         </w:rPr>
-        <w:lastRenderedPageBreak/>
+        <w:t>optional</w:t>
+      </w:r>
+      <w:r>
+        <w:rPr>
+          <w:sz w:val="24"/>
+          <w:szCs w:val="24"/>
+        </w:rPr>
+        <w:t xml:space="preserve"> capability of Manufacturing Execution Impact Analysis that becomes available when MIAE is integrated with execution-layer systems capable of providing Equipment master data and its association with Work Centers. While all ERP systems typically provide Work Orders, Operations, and Work Centers required for production planning, they do not consistently identify the specific physical equipment executing an operation. </w:t>
+      </w:r>
+    </w:p>
+    <w:p>
+      <w:pPr>
+        <w:rPr>
+          <w:sz w:val="24"/>
+          <w:szCs w:val="24"/>
+        </w:rPr>
+      </w:pPr>
+      <w:r>
+        <w:rPr>
+          <w:sz w:val="24"/>
+          <w:szCs w:val="24"/>
+        </w:rPr>
+        <w:t xml:space="preserve">When an MES (Manufacturing Execution System), EAM (Enterprise Asset Management), CMMS (Computerized Maintenance Management System), </w:t>
+      </w:r>
+      <w:proofErr w:type="spellStart"/>
+      <w:r>
+        <w:rPr>
+          <w:sz w:val="24"/>
+          <w:szCs w:val="24"/>
+        </w:rPr>
+        <w:t>IIoT</w:t>
+      </w:r>
+      <w:proofErr w:type="spellEnd"/>
+      <w:r>
+        <w:rPr>
+          <w:sz w:val="24"/>
+          <w:szCs w:val="24"/>
+        </w:rPr>
+        <w:t xml:space="preserve"> platform, or another connected execution system provides Equipment information and its assignment to Work Centers, MIAE extends its manufacturing knowledge graph to include Equipment as the physical execution asset. This enables the Impact Engine to trace business impact beyond the Work Center level and answer questions such as which Work Orders execute on a specific Equipment, which Products and Customers are affected by an Equipment failure, and what business impact results from Equipment unavailability. </w:t>
+      </w:r>
+    </w:p>
+    <w:p>
+      <w:pPr>
+        <w:rPr>
+          <w:sz w:val="24"/>
+          <w:szCs w:val="24"/>
+        </w:rPr>
+      </w:pPr>
+      <w:r>
+        <w:rPr>
+          <w:b/>
+          <w:bCs/>
+          <w:sz w:val="24"/>
+          <w:szCs w:val="24"/>
+        </w:rPr>
         <w:t>Traversal</w:t>
       </w:r>
       <w:r>
@@ -2384,20 +3704,13 @@
     </w:p>
     <w:p>
       <w:pPr>
-        <w:rPr>
-          <w:b/>
-          <w:bCs/>
-          <w:sz w:val="24"/>
-          <w:szCs w:val="24"/>
-        </w:rPr>
+        <w:pStyle w:val="Heading3"/>
       </w:pPr>
       <w:r>
-        <w:rPr>
-          <w:b/>
-          <w:bCs/>
-          <w:sz w:val="24"/>
-          <w:szCs w:val="24"/>
-        </w:rPr>
+        <w:lastRenderedPageBreak/>
+        <w:t xml:space="preserve">9.1 </w:t>
+      </w:r>
+      <w:r>
         <w:t>Request Payload:</w:t>
       </w:r>
     </w:p>
@@ -2537,604 +3850,598 @@
     </w:p>
     <w:p>
       <w:pPr>
-        <w:rPr>
-          <w:b/>
-          <w:bCs/>
-          <w:sz w:val="24"/>
-          <w:szCs w:val="24"/>
-        </w:rPr>
+        <w:pStyle w:val="Heading3"/>
       </w:pPr>
       <w:r>
-        <w:rPr>
-          <w:b/>
-          <w:bCs/>
-          <w:sz w:val="24"/>
-          <w:szCs w:val="24"/>
-        </w:rPr>
+        <w:t xml:space="preserve">9.2 </w:t>
+      </w:r>
+      <w:r>
         <w:t>Response Payload:</w:t>
       </w:r>
     </w:p>
-    <w:p>
-      <w:r>
-        <w:t>{</w:t>
-      </w:r>
-      <w:r>
-        <w:br/>
-        <w:t>"</w:t>
-      </w:r>
-      <w:proofErr w:type="spellStart"/>
-      <w:r>
-        <w:t>entityType</w:t>
-      </w:r>
-      <w:proofErr w:type="spellEnd"/>
-      <w:r>
-        <w:t>": "EQUIPMENT",</w:t>
-      </w:r>
-      <w:r>
-        <w:br/>
-        <w:t>"</w:t>
-      </w:r>
-      <w:proofErr w:type="spellStart"/>
-      <w:r>
-        <w:t>entityId</w:t>
-      </w:r>
-      <w:proofErr w:type="spellEnd"/>
-      <w:r>
-        <w:t>": "EQ-101",</w:t>
-      </w:r>
-      <w:r>
-        <w:br/>
-        <w:t>"</w:t>
-      </w:r>
-      <w:proofErr w:type="spellStart"/>
-      <w:r>
-        <w:t>entityName</w:t>
-      </w:r>
-      <w:proofErr w:type="spellEnd"/>
-      <w:r>
-        <w:t>": "SMT Machine 01",</w:t>
-      </w:r>
-      <w:r>
-        <w:br/>
-      </w:r>
-      <w:r>
-        <w:br/>
-        <w:t>"summary": {</w:t>
-      </w:r>
-      <w:r>
-        <w:br/>
-        <w:t xml:space="preserve">  "</w:t>
-      </w:r>
-      <w:proofErr w:type="spellStart"/>
-      <w:r>
-        <w:t>affectedOperations</w:t>
-      </w:r>
-      <w:proofErr w:type="spellEnd"/>
-      <w:r>
-        <w:t>": 6,</w:t>
-      </w:r>
-      <w:r>
-        <w:br/>
-        <w:t xml:space="preserve">  "</w:t>
-      </w:r>
-      <w:proofErr w:type="spellStart"/>
-      <w:r>
-        <w:t>affectedWorkOrders</w:t>
-      </w:r>
-      <w:proofErr w:type="spellEnd"/>
-      <w:r>
-        <w:t>": 12,</w:t>
-      </w:r>
-      <w:r>
-        <w:br/>
-        <w:t xml:space="preserve">  "</w:t>
-      </w:r>
-      <w:proofErr w:type="spellStart"/>
-      <w:r>
-        <w:t>affectedProducts</w:t>
-      </w:r>
-      <w:proofErr w:type="spellEnd"/>
-      <w:r>
-        <w:t>": 5,</w:t>
-      </w:r>
-      <w:r>
-        <w:br/>
-        <w:t xml:space="preserve">  "</w:t>
-      </w:r>
-      <w:proofErr w:type="spellStart"/>
-      <w:r>
-        <w:t>affectedSalesOrders</w:t>
-      </w:r>
-      <w:proofErr w:type="spellEnd"/>
-      <w:r>
-        <w:t>": 18,</w:t>
-      </w:r>
-      <w:r>
-        <w:br/>
-        <w:t xml:space="preserve">  "</w:t>
-      </w:r>
-      <w:proofErr w:type="spellStart"/>
-      <w:r>
-        <w:t>affectedCustomers</w:t>
-      </w:r>
-      <w:proofErr w:type="spellEnd"/>
-      <w:r>
-        <w:t>": 7,</w:t>
-      </w:r>
-      <w:r>
-        <w:br/>
-        <w:t xml:space="preserve">  "</w:t>
-      </w:r>
-      <w:proofErr w:type="spellStart"/>
-      <w:r>
-        <w:t>revenueAtRisk</w:t>
-      </w:r>
-      <w:proofErr w:type="spellEnd"/>
-      <w:r>
-        <w:t>": 1250000</w:t>
-      </w:r>
-      <w:r>
-        <w:br/>
-        <w:t>},</w:t>
-      </w:r>
-      <w:r>
-        <w:br/>
-      </w:r>
-      <w:r>
-        <w:br/>
-        <w:t>"</w:t>
-      </w:r>
-      <w:proofErr w:type="spellStart"/>
-      <w:r>
-        <w:t>workCenter</w:t>
-      </w:r>
-      <w:proofErr w:type="spellEnd"/>
-      <w:r>
-        <w:t>": {</w:t>
-      </w:r>
-      <w:r>
-        <w:br/>
-        <w:t xml:space="preserve">  "</w:t>
-      </w:r>
-      <w:proofErr w:type="spellStart"/>
-      <w:r>
-        <w:t>workCenterId</w:t>
-      </w:r>
-      <w:proofErr w:type="spellEnd"/>
-      <w:r>
-        <w:t>": "WC-100",</w:t>
-      </w:r>
-      <w:r>
-        <w:br/>
-        <w:t xml:space="preserve">  "code": "WC-SMT",</w:t>
-      </w:r>
-      <w:r>
-        <w:br/>
-        <w:t xml:space="preserve">  "name": "SMT Assembly"</w:t>
-      </w:r>
-      <w:r>
-        <w:br/>
-        <w:t>},</w:t>
-      </w:r>
-      <w:r>
-        <w:br/>
-      </w:r>
-      <w:r>
-        <w:lastRenderedPageBreak/>
-        <w:br/>
-        <w:t>"operations": [</w:t>
-      </w:r>
-      <w:r>
-        <w:br/>
-        <w:t>{</w:t>
-      </w:r>
-      <w:r>
-        <w:br/>
-        <w:t xml:space="preserve">  "</w:t>
-      </w:r>
-      <w:proofErr w:type="spellStart"/>
-      <w:r>
-        <w:t>operationNumber</w:t>
-      </w:r>
-      <w:proofErr w:type="spellEnd"/>
-      <w:r>
-        <w:t>": 10,</w:t>
-      </w:r>
-      <w:r>
-        <w:br/>
-        <w:t xml:space="preserve">  "name": "SMT Assembly",</w:t>
-      </w:r>
-      <w:r>
-        <w:br/>
-        <w:t xml:space="preserve">  "status": "NOT_STARTED"</w:t>
-      </w:r>
-      <w:r>
-        <w:br/>
-        <w:t>},</w:t>
-      </w:r>
-      <w:r>
-        <w:br/>
-        <w:t>{</w:t>
-      </w:r>
-      <w:r>
-        <w:br/>
-        <w:t xml:space="preserve">  "</w:t>
-      </w:r>
-      <w:proofErr w:type="spellStart"/>
-      <w:r>
-        <w:t>operationNumber</w:t>
-      </w:r>
-      <w:proofErr w:type="spellEnd"/>
-      <w:r>
-        <w:t>": 20,</w:t>
-      </w:r>
-      <w:r>
-        <w:br/>
-        <w:t xml:space="preserve">  "name": "AOI Inspection",</w:t>
-      </w:r>
-      <w:r>
-        <w:br/>
-        <w:t xml:space="preserve">  "status": "IN_PROGRESS"</w:t>
-      </w:r>
-      <w:r>
-        <w:br/>
-        <w:t>}</w:t>
-      </w:r>
-      <w:r>
-        <w:br/>
-        <w:t>],</w:t>
-      </w:r>
-      <w:r>
-        <w:br/>
-      </w:r>
-      <w:r>
-        <w:br/>
-        <w:t>"</w:t>
-      </w:r>
-      <w:proofErr w:type="spellStart"/>
-      <w:r>
-        <w:t>affectedWorkOrders</w:t>
-      </w:r>
-      <w:proofErr w:type="spellEnd"/>
-      <w:r>
-        <w:t>": [</w:t>
-      </w:r>
-      <w:r>
-        <w:br/>
-        <w:t>{</w:t>
-      </w:r>
-      <w:r>
-        <w:br/>
-        <w:t xml:space="preserve">  "</w:t>
-      </w:r>
-      <w:proofErr w:type="spellStart"/>
-      <w:r>
-        <w:t>workOrderId</w:t>
-      </w:r>
-      <w:proofErr w:type="spellEnd"/>
-      <w:r>
-        <w:t>": "WO-1001",</w:t>
-      </w:r>
-      <w:r>
-        <w:br/>
-        <w:t xml:space="preserve">  "priority": "HIGH",</w:t>
-      </w:r>
-      <w:r>
-        <w:br/>
-        <w:t xml:space="preserve">  "status": "RELEASED",</w:t>
-      </w:r>
-      <w:r>
-        <w:br/>
-        <w:t xml:space="preserve">  "</w:t>
-      </w:r>
-      <w:proofErr w:type="spellStart"/>
-      <w:r>
-        <w:t>remainingQty</w:t>
-      </w:r>
-      <w:proofErr w:type="spellEnd"/>
-      <w:r>
-        <w:t>": 50</w:t>
-      </w:r>
-      <w:r>
-        <w:br/>
-        <w:t>},</w:t>
-      </w:r>
-      <w:r>
-        <w:br/>
-        <w:t>{</w:t>
-      </w:r>
-      <w:r>
-        <w:br/>
-        <w:t xml:space="preserve">  "</w:t>
-      </w:r>
-      <w:proofErr w:type="spellStart"/>
-      <w:r>
-        <w:t>workOrderId</w:t>
-      </w:r>
-      <w:proofErr w:type="spellEnd"/>
-      <w:r>
-        <w:t>": "WO-1005",</w:t>
-      </w:r>
-      <w:r>
-        <w:br/>
-        <w:t xml:space="preserve">  "priority": "MEDIUM",</w:t>
-      </w:r>
-      <w:r>
-        <w:br/>
-        <w:t xml:space="preserve">  "status": "IN_PROGRESS",</w:t>
-      </w:r>
-      <w:r>
-        <w:br/>
-        <w:t xml:space="preserve">  "</w:t>
-      </w:r>
-      <w:proofErr w:type="spellStart"/>
-      <w:r>
-        <w:t>remainingQty</w:t>
-      </w:r>
-      <w:proofErr w:type="spellEnd"/>
-      <w:r>
-        <w:t>": 120</w:t>
-      </w:r>
-      <w:r>
-        <w:br/>
-        <w:t>}</w:t>
-      </w:r>
-      <w:r>
-        <w:br/>
-        <w:t>],</w:t>
-      </w:r>
-      <w:r>
-        <w:br/>
-      </w:r>
-      <w:r>
-        <w:br/>
-        <w:t>"</w:t>
-      </w:r>
-      <w:proofErr w:type="spellStart"/>
-      <w:r>
-        <w:t>affectedProducts</w:t>
-      </w:r>
-      <w:proofErr w:type="spellEnd"/>
-      <w:r>
-        <w:t>": [</w:t>
-      </w:r>
-      <w:r>
-        <w:br/>
-        <w:t>{</w:t>
-      </w:r>
-      <w:r>
-        <w:br/>
-        <w:t xml:space="preserve">  "</w:t>
-      </w:r>
-      <w:proofErr w:type="spellStart"/>
-      <w:r>
-        <w:t>productId</w:t>
-      </w:r>
-      <w:proofErr w:type="spellEnd"/>
-      <w:r>
-        <w:t>": "P100",</w:t>
-      </w:r>
-      <w:r>
-        <w:br/>
-        <w:t xml:space="preserve">  "code": "SENSOR-100",</w:t>
-      </w:r>
-      <w:r>
-        <w:br/>
-        <w:t xml:space="preserve">  "name": "Industrial Sensor"</w:t>
-      </w:r>
-      <w:r>
-        <w:br/>
-        <w:t>},</w:t>
-      </w:r>
-      <w:r>
-        <w:br/>
-        <w:t>{</w:t>
-      </w:r>
-      <w:r>
-        <w:br/>
-        <w:t xml:space="preserve">  "</w:t>
-      </w:r>
-      <w:proofErr w:type="spellStart"/>
-      <w:r>
-        <w:t>productId</w:t>
-      </w:r>
-      <w:proofErr w:type="spellEnd"/>
-      <w:r>
-        <w:t>": "P200",</w:t>
-      </w:r>
-      <w:r>
-        <w:br/>
-        <w:t xml:space="preserve">  "code": "CTRL-200",</w:t>
-      </w:r>
-      <w:r>
-        <w:br/>
-        <w:t xml:space="preserve">  "name": "Industrial Controller"</w:t>
-      </w:r>
-      <w:r>
-        <w:br/>
-        <w:t>}</w:t>
-      </w:r>
-      <w:r>
-        <w:br/>
-        <w:t>],</w:t>
-      </w:r>
-      <w:r>
-        <w:br/>
-      </w:r>
-      <w:r>
-        <w:br/>
-        <w:t>"</w:t>
-      </w:r>
-      <w:proofErr w:type="spellStart"/>
-      <w:r>
-        <w:t>affectedSalesOrders</w:t>
-      </w:r>
-      <w:proofErr w:type="spellEnd"/>
-      <w:r>
-        <w:t>": [</w:t>
-      </w:r>
-      <w:r>
-        <w:br/>
-      </w:r>
-      <w:r>
-        <w:lastRenderedPageBreak/>
-        <w:t>{</w:t>
-      </w:r>
-      <w:r>
-        <w:br/>
-        <w:t xml:space="preserve">  "</w:t>
-      </w:r>
-      <w:proofErr w:type="spellStart"/>
-      <w:r>
-        <w:t>salesOrderId</w:t>
-      </w:r>
-      <w:proofErr w:type="spellEnd"/>
-      <w:r>
-        <w:t>": "SO-101",</w:t>
-      </w:r>
-      <w:r>
-        <w:br/>
-        <w:t xml:space="preserve">  "customer": "Acme Manufacturing",</w:t>
-      </w:r>
-      <w:r>
-        <w:br/>
-        <w:t xml:space="preserve">  "</w:t>
-      </w:r>
-      <w:proofErr w:type="spellStart"/>
-      <w:r>
-        <w:t>orderValue</w:t>
-      </w:r>
-      <w:proofErr w:type="spellEnd"/>
-      <w:r>
-        <w:t>": 450000</w:t>
-      </w:r>
-      <w:r>
-        <w:br/>
-        <w:t>},</w:t>
-      </w:r>
-      <w:r>
-        <w:br/>
-        <w:t>{</w:t>
-      </w:r>
-      <w:r>
-        <w:br/>
-        <w:t xml:space="preserve">  "</w:t>
-      </w:r>
-      <w:proofErr w:type="spellStart"/>
-      <w:r>
-        <w:t>salesOrderId</w:t>
-      </w:r>
-      <w:proofErr w:type="spellEnd"/>
-      <w:r>
-        <w:t>": "SO-102",</w:t>
-      </w:r>
-      <w:r>
-        <w:br/>
-        <w:t xml:space="preserve">  "customer": "Global Industries",</w:t>
-      </w:r>
-      <w:r>
-        <w:br/>
-        <w:t xml:space="preserve">  "</w:t>
-      </w:r>
-      <w:proofErr w:type="spellStart"/>
-      <w:r>
-        <w:t>orderValue</w:t>
-      </w:r>
-      <w:proofErr w:type="spellEnd"/>
-      <w:r>
-        <w:t>": 800000</w:t>
-      </w:r>
-      <w:r>
-        <w:br/>
-        <w:t>}</w:t>
-      </w:r>
-      <w:r>
-        <w:br/>
-        <w:t>],</w:t>
-      </w:r>
-      <w:r>
-        <w:br/>
-      </w:r>
-      <w:r>
-        <w:br/>
-        <w:t>"</w:t>
-      </w:r>
-      <w:proofErr w:type="spellStart"/>
-      <w:r>
-        <w:t>affectedCustomers</w:t>
-      </w:r>
-      <w:proofErr w:type="spellEnd"/>
-      <w:r>
-        <w:t>": [</w:t>
-      </w:r>
-      <w:r>
-        <w:br/>
-        <w:t>{</w:t>
-      </w:r>
-      <w:r>
-        <w:br/>
-        <w:t xml:space="preserve">  "</w:t>
-      </w:r>
-      <w:proofErr w:type="spellStart"/>
-      <w:r>
-        <w:t>customerId</w:t>
-      </w:r>
-      <w:proofErr w:type="spellEnd"/>
-      <w:r>
-        <w:t>": "CUST-100",</w:t>
-      </w:r>
-      <w:r>
-        <w:br/>
-        <w:t xml:space="preserve">  "name": "Acme Manufacturing"</w:t>
-      </w:r>
-      <w:r>
-        <w:br/>
-        <w:t>},</w:t>
-      </w:r>
-      <w:r>
-        <w:br/>
-        <w:t>{</w:t>
-      </w:r>
-      <w:r>
-        <w:br/>
-        <w:t xml:space="preserve">  "</w:t>
-      </w:r>
-      <w:proofErr w:type="spellStart"/>
-      <w:r>
-        <w:t>customerId</w:t>
-      </w:r>
-      <w:proofErr w:type="spellEnd"/>
-      <w:r>
-        <w:t>": "CUST-200",</w:t>
-      </w:r>
-      <w:r>
-        <w:br/>
-        <w:t xml:space="preserve">  "name": "Global Industries"</w:t>
-      </w:r>
-      <w:r>
-        <w:br/>
-        <w:t>}</w:t>
-      </w:r>
-      <w:r>
-        <w:br/>
-        <w:t>]</w:t>
-      </w:r>
-      <w:r>
-        <w:br/>
-        <w:t>}</w:t>
-      </w:r>
-    </w:p>
-    <w:p/>
-    <w:p/>
-    <w:p/>
-    <w:p/>
-    <w:p/>
-    <w:p/>
-    <w:p/>
-    <w:p/>
-    <w:p/>
-    <w:p/>
-    <w:p/>
+    <w:tbl>
+      <w:tblPr>
+        <w:tblStyle w:val="TableGrid"/>
+        <w:tblW w:w="0" w:type="auto"/>
+        <w:tblInd w:w="108" w:type="dxa"/>
+        <w:tblLook w:val="04A0" w:firstRow="1" w:lastRow="0" w:firstColumn="1" w:lastColumn="0" w:noHBand="0" w:noVBand="1"/>
+      </w:tblPr>
+      <w:tblGrid>
+        <w:gridCol w:w="8748"/>
+      </w:tblGrid>
+      <w:tr>
+        <w:tc>
+          <w:tcPr>
+            <w:tcW w:w="8748" w:type="dxa"/>
+          </w:tcPr>
+          <w:p>
+            <w:r>
+              <w:t>{</w:t>
+            </w:r>
+            <w:r>
+              <w:br/>
+              <w:t>"</w:t>
+            </w:r>
+            <w:proofErr w:type="spellStart"/>
+            <w:r>
+              <w:t>entityType</w:t>
+            </w:r>
+            <w:proofErr w:type="spellEnd"/>
+            <w:r>
+              <w:t>": "EQUIPMENT",</w:t>
+            </w:r>
+            <w:r>
+              <w:br/>
+              <w:t>"</w:t>
+            </w:r>
+            <w:proofErr w:type="spellStart"/>
+            <w:r>
+              <w:t>entityId</w:t>
+            </w:r>
+            <w:proofErr w:type="spellEnd"/>
+            <w:r>
+              <w:t>": "EQ-101",</w:t>
+            </w:r>
+            <w:r>
+              <w:br/>
+              <w:t>"</w:t>
+            </w:r>
+            <w:proofErr w:type="spellStart"/>
+            <w:r>
+              <w:t>entityName</w:t>
+            </w:r>
+            <w:proofErr w:type="spellEnd"/>
+            <w:r>
+              <w:t>": "SMT Machine 01",</w:t>
+            </w:r>
+            <w:r>
+              <w:br/>
+            </w:r>
+            <w:r>
+              <w:br/>
+              <w:t>"summary": {</w:t>
+            </w:r>
+            <w:r>
+              <w:br/>
+              <w:t xml:space="preserve">  "</w:t>
+            </w:r>
+            <w:proofErr w:type="spellStart"/>
+            <w:r>
+              <w:t>affectedOperations</w:t>
+            </w:r>
+            <w:proofErr w:type="spellEnd"/>
+            <w:r>
+              <w:t>": 6,</w:t>
+            </w:r>
+            <w:r>
+              <w:br/>
+              <w:t xml:space="preserve">  "</w:t>
+            </w:r>
+            <w:proofErr w:type="spellStart"/>
+            <w:r>
+              <w:t>affectedWorkOrders</w:t>
+            </w:r>
+            <w:proofErr w:type="spellEnd"/>
+            <w:r>
+              <w:t>": 12,</w:t>
+            </w:r>
+            <w:r>
+              <w:br/>
+              <w:t xml:space="preserve">  "</w:t>
+            </w:r>
+            <w:proofErr w:type="spellStart"/>
+            <w:r>
+              <w:t>affectedProducts</w:t>
+            </w:r>
+            <w:proofErr w:type="spellEnd"/>
+            <w:r>
+              <w:t>": 5,</w:t>
+            </w:r>
+            <w:r>
+              <w:br/>
+              <w:t xml:space="preserve">  "</w:t>
+            </w:r>
+            <w:proofErr w:type="spellStart"/>
+            <w:r>
+              <w:t>affectedSalesOrders</w:t>
+            </w:r>
+            <w:proofErr w:type="spellEnd"/>
+            <w:r>
+              <w:t>": 18,</w:t>
+            </w:r>
+            <w:r>
+              <w:br/>
+              <w:t xml:space="preserve">  "</w:t>
+            </w:r>
+            <w:proofErr w:type="spellStart"/>
+            <w:r>
+              <w:t>affectedCustomers</w:t>
+            </w:r>
+            <w:proofErr w:type="spellEnd"/>
+            <w:r>
+              <w:t>": 7,</w:t>
+            </w:r>
+            <w:r>
+              <w:br/>
+              <w:t xml:space="preserve">  "</w:t>
+            </w:r>
+            <w:proofErr w:type="spellStart"/>
+            <w:r>
+              <w:t>revenueAtRisk</w:t>
+            </w:r>
+            <w:proofErr w:type="spellEnd"/>
+            <w:r>
+              <w:t>": 1250000</w:t>
+            </w:r>
+            <w:r>
+              <w:br/>
+              <w:t>},</w:t>
+            </w:r>
+            <w:r>
+              <w:br/>
+            </w:r>
+            <w:r>
+              <w:br/>
+              <w:t>"</w:t>
+            </w:r>
+            <w:proofErr w:type="spellStart"/>
+            <w:r>
+              <w:t>workCenter</w:t>
+            </w:r>
+            <w:proofErr w:type="spellEnd"/>
+            <w:r>
+              <w:t>": {</w:t>
+            </w:r>
+            <w:r>
+              <w:br/>
+              <w:t xml:space="preserve">  "</w:t>
+            </w:r>
+            <w:proofErr w:type="spellStart"/>
+            <w:r>
+              <w:t>workCenterId</w:t>
+            </w:r>
+            <w:proofErr w:type="spellEnd"/>
+            <w:r>
+              <w:t>": "WC-100",</w:t>
+            </w:r>
+            <w:r>
+              <w:br/>
+              <w:t xml:space="preserve">  "code": "WC-SMT",</w:t>
+            </w:r>
+            <w:r>
+              <w:br/>
+              <w:t xml:space="preserve">  "name": "SMT Assembly"</w:t>
+            </w:r>
+            <w:r>
+              <w:br/>
+              <w:t>},</w:t>
+            </w:r>
+            <w:r>
+              <w:br/>
+            </w:r>
+            <w:r>
+              <w:br/>
+              <w:t>"operations": [</w:t>
+            </w:r>
+            <w:r>
+              <w:br/>
+              <w:t>{</w:t>
+            </w:r>
+            <w:r>
+              <w:br/>
+              <w:t xml:space="preserve">  "</w:t>
+            </w:r>
+            <w:proofErr w:type="spellStart"/>
+            <w:r>
+              <w:t>operationNumber</w:t>
+            </w:r>
+            <w:proofErr w:type="spellEnd"/>
+            <w:r>
+              <w:t>": 10,</w:t>
+            </w:r>
+            <w:r>
+              <w:br/>
+              <w:t xml:space="preserve">  "name": "SMT Assembly",</w:t>
+            </w:r>
+            <w:r>
+              <w:br/>
+              <w:t xml:space="preserve">  "status": "NOT_STARTED"</w:t>
+            </w:r>
+            <w:r>
+              <w:br/>
+              <w:t>},</w:t>
+            </w:r>
+            <w:r>
+              <w:br/>
+              <w:t>{</w:t>
+            </w:r>
+            <w:r>
+              <w:br/>
+              <w:t xml:space="preserve">  "</w:t>
+            </w:r>
+            <w:proofErr w:type="spellStart"/>
+            <w:r>
+              <w:t>operationNumber</w:t>
+            </w:r>
+            <w:proofErr w:type="spellEnd"/>
+            <w:r>
+              <w:t>": 20,</w:t>
+            </w:r>
+            <w:r>
+              <w:br/>
+              <w:t xml:space="preserve">  "name": "AOI Inspection",</w:t>
+            </w:r>
+            <w:r>
+              <w:br/>
+              <w:t xml:space="preserve">  "status": "IN_PROGRESS"</w:t>
+            </w:r>
+            <w:r>
+              <w:br/>
+              <w:t>}</w:t>
+            </w:r>
+            <w:r>
+              <w:br/>
+              <w:t>],</w:t>
+            </w:r>
+            <w:r>
+              <w:br/>
+            </w:r>
+            <w:r>
+              <w:br/>
+              <w:t>"</w:t>
+            </w:r>
+            <w:proofErr w:type="spellStart"/>
+            <w:r>
+              <w:t>affectedWorkOrders</w:t>
+            </w:r>
+            <w:proofErr w:type="spellEnd"/>
+            <w:r>
+              <w:t>": [</w:t>
+            </w:r>
+            <w:r>
+              <w:br/>
+              <w:t>{</w:t>
+            </w:r>
+            <w:r>
+              <w:br/>
+              <w:t xml:space="preserve">  "</w:t>
+            </w:r>
+            <w:proofErr w:type="spellStart"/>
+            <w:r>
+              <w:t>workOrderId</w:t>
+            </w:r>
+            <w:proofErr w:type="spellEnd"/>
+            <w:r>
+              <w:t>": "WO-1001",</w:t>
+            </w:r>
+            <w:r>
+              <w:br/>
+              <w:t xml:space="preserve">  "priority": "HIGH",</w:t>
+            </w:r>
+            <w:r>
+              <w:br/>
+              <w:t xml:space="preserve">  "status": "RELEASED",</w:t>
+            </w:r>
+            <w:r>
+              <w:br/>
+              <w:t xml:space="preserve">  "</w:t>
+            </w:r>
+            <w:proofErr w:type="spellStart"/>
+            <w:r>
+              <w:t>remainingQty</w:t>
+            </w:r>
+            <w:proofErr w:type="spellEnd"/>
+            <w:r>
+              <w:t>": 50</w:t>
+            </w:r>
+            <w:r>
+              <w:br/>
+            </w:r>
+            <w:r>
+              <w:lastRenderedPageBreak/>
+              <w:t>},</w:t>
+            </w:r>
+            <w:r>
+              <w:br/>
+              <w:t>{</w:t>
+            </w:r>
+            <w:r>
+              <w:br/>
+              <w:t xml:space="preserve">  "</w:t>
+            </w:r>
+            <w:proofErr w:type="spellStart"/>
+            <w:r>
+              <w:t>workOrderId</w:t>
+            </w:r>
+            <w:proofErr w:type="spellEnd"/>
+            <w:r>
+              <w:t>": "WO-1005",</w:t>
+            </w:r>
+            <w:r>
+              <w:br/>
+              <w:t xml:space="preserve">  "priority": "MEDIUM",</w:t>
+            </w:r>
+            <w:r>
+              <w:br/>
+              <w:t xml:space="preserve">  "status": "IN_PROGRESS",</w:t>
+            </w:r>
+            <w:r>
+              <w:br/>
+              <w:t xml:space="preserve">  "</w:t>
+            </w:r>
+            <w:proofErr w:type="spellStart"/>
+            <w:r>
+              <w:t>remainingQty</w:t>
+            </w:r>
+            <w:proofErr w:type="spellEnd"/>
+            <w:r>
+              <w:t>": 120</w:t>
+            </w:r>
+            <w:r>
+              <w:br/>
+              <w:t>}</w:t>
+            </w:r>
+            <w:r>
+              <w:br/>
+              <w:t>],</w:t>
+            </w:r>
+            <w:r>
+              <w:br/>
+            </w:r>
+            <w:r>
+              <w:br/>
+              <w:t>"</w:t>
+            </w:r>
+            <w:proofErr w:type="spellStart"/>
+            <w:r>
+              <w:t>affectedProducts</w:t>
+            </w:r>
+            <w:proofErr w:type="spellEnd"/>
+            <w:r>
+              <w:t>": [</w:t>
+            </w:r>
+            <w:r>
+              <w:br/>
+              <w:t>{</w:t>
+            </w:r>
+            <w:r>
+              <w:br/>
+              <w:t xml:space="preserve">  "</w:t>
+            </w:r>
+            <w:proofErr w:type="spellStart"/>
+            <w:r>
+              <w:t>productId</w:t>
+            </w:r>
+            <w:proofErr w:type="spellEnd"/>
+            <w:r>
+              <w:t>": "P100",</w:t>
+            </w:r>
+            <w:r>
+              <w:br/>
+              <w:t xml:space="preserve">  "code": "SENSOR-100",</w:t>
+            </w:r>
+            <w:r>
+              <w:br/>
+              <w:t xml:space="preserve">  "name": "Industrial Sensor"</w:t>
+            </w:r>
+            <w:r>
+              <w:br/>
+              <w:t>},</w:t>
+            </w:r>
+            <w:r>
+              <w:br/>
+              <w:t>{</w:t>
+            </w:r>
+            <w:r>
+              <w:br/>
+              <w:t xml:space="preserve">  "</w:t>
+            </w:r>
+            <w:proofErr w:type="spellStart"/>
+            <w:r>
+              <w:t>productId</w:t>
+            </w:r>
+            <w:proofErr w:type="spellEnd"/>
+            <w:r>
+              <w:t>": "P200",</w:t>
+            </w:r>
+            <w:r>
+              <w:br/>
+              <w:t xml:space="preserve">  "code": "CTRL-200",</w:t>
+            </w:r>
+            <w:r>
+              <w:br/>
+              <w:t xml:space="preserve">  "name": "Industrial Controller"</w:t>
+            </w:r>
+            <w:r>
+              <w:br/>
+              <w:t>}</w:t>
+            </w:r>
+            <w:r>
+              <w:br/>
+              <w:t>],</w:t>
+            </w:r>
+            <w:r>
+              <w:br/>
+            </w:r>
+            <w:r>
+              <w:br/>
+              <w:t>"</w:t>
+            </w:r>
+            <w:proofErr w:type="spellStart"/>
+            <w:r>
+              <w:t>affectedSalesOrders</w:t>
+            </w:r>
+            <w:proofErr w:type="spellEnd"/>
+            <w:r>
+              <w:t>": [</w:t>
+            </w:r>
+            <w:r>
+              <w:br/>
+              <w:t>{</w:t>
+            </w:r>
+            <w:r>
+              <w:br/>
+              <w:t xml:space="preserve">  "</w:t>
+            </w:r>
+            <w:proofErr w:type="spellStart"/>
+            <w:r>
+              <w:t>salesOrderId</w:t>
+            </w:r>
+            <w:proofErr w:type="spellEnd"/>
+            <w:r>
+              <w:t>": "SO-101",</w:t>
+            </w:r>
+            <w:r>
+              <w:br/>
+              <w:t xml:space="preserve">  "customer": "Acme Manufacturing",</w:t>
+            </w:r>
+            <w:r>
+              <w:br/>
+              <w:t xml:space="preserve">  "</w:t>
+            </w:r>
+            <w:proofErr w:type="spellStart"/>
+            <w:r>
+              <w:t>orderValue</w:t>
+            </w:r>
+            <w:proofErr w:type="spellEnd"/>
+            <w:r>
+              <w:t>": 450000</w:t>
+            </w:r>
+            <w:r>
+              <w:br/>
+              <w:t>},</w:t>
+            </w:r>
+            <w:r>
+              <w:br/>
+              <w:t>{</w:t>
+            </w:r>
+            <w:r>
+              <w:br/>
+              <w:t xml:space="preserve">  "</w:t>
+            </w:r>
+            <w:proofErr w:type="spellStart"/>
+            <w:r>
+              <w:t>salesOrderId</w:t>
+            </w:r>
+            <w:proofErr w:type="spellEnd"/>
+            <w:r>
+              <w:t>": "SO-102",</w:t>
+            </w:r>
+            <w:r>
+              <w:br/>
+              <w:t xml:space="preserve">  "customer": "Global Industries",</w:t>
+            </w:r>
+            <w:r>
+              <w:br/>
+              <w:t xml:space="preserve">  "</w:t>
+            </w:r>
+            <w:proofErr w:type="spellStart"/>
+            <w:r>
+              <w:t>orderValue</w:t>
+            </w:r>
+            <w:proofErr w:type="spellEnd"/>
+            <w:r>
+              <w:t>": 800000</w:t>
+            </w:r>
+            <w:r>
+              <w:br/>
+              <w:t>}</w:t>
+            </w:r>
+            <w:r>
+              <w:br/>
+              <w:t>],</w:t>
+            </w:r>
+            <w:r>
+              <w:br/>
+            </w:r>
+            <w:r>
+              <w:br/>
+              <w:t>"</w:t>
+            </w:r>
+            <w:proofErr w:type="spellStart"/>
+            <w:r>
+              <w:t>affectedCustomers</w:t>
+            </w:r>
+            <w:proofErr w:type="spellEnd"/>
+            <w:r>
+              <w:t>": [</w:t>
+            </w:r>
+            <w:r>
+              <w:br/>
+              <w:t>{</w:t>
+            </w:r>
+            <w:r>
+              <w:br/>
+              <w:t xml:space="preserve">  "</w:t>
+            </w:r>
+            <w:proofErr w:type="spellStart"/>
+            <w:r>
+              <w:t>customerId</w:t>
+            </w:r>
+            <w:proofErr w:type="spellEnd"/>
+            <w:r>
+              <w:t>": "CUST-100",</w:t>
+            </w:r>
+            <w:r>
+              <w:br/>
+              <w:t xml:space="preserve">  "name": "Acme Manufacturing"</w:t>
+            </w:r>
+            <w:r>
+              <w:br/>
+              <w:t>},</w:t>
+            </w:r>
+            <w:r>
+              <w:br/>
+              <w:t>{</w:t>
+            </w:r>
+            <w:r>
+              <w:br/>
+              <w:t xml:space="preserve">  "</w:t>
+            </w:r>
+            <w:proofErr w:type="spellStart"/>
+            <w:r>
+              <w:t>customerId</w:t>
+            </w:r>
+            <w:proofErr w:type="spellEnd"/>
+            <w:r>
+              <w:t>": "CUST-200",</w:t>
+            </w:r>
+            <w:r>
+              <w:br/>
+              <w:t xml:space="preserve">  "name": "Global Industries"</w:t>
+            </w:r>
+            <w:r>
+              <w:br/>
+              <w:t>}</w:t>
+            </w:r>
+            <w:r>
+              <w:br/>
+              <w:t>]}</w:t>
+            </w:r>
+          </w:p>
+        </w:tc>
+      </w:tr>
+    </w:tbl>
     <w:p/>
     <w:p/>
     <w:p>
@@ -3142,7 +4449,17 @@
         <w:pStyle w:val="Heading2"/>
       </w:pPr>
       <w:r>
-        <w:t>9. Personas and Representative Questions</w:t>
+        <w:lastRenderedPageBreak/>
+        <w:t>10</w:t>
+      </w:r>
+      <w:r>
+        <w:t xml:space="preserve">. </w:t>
+      </w:r>
+      <w:r>
+        <w:t xml:space="preserve">Equipment Impact Analysis - </w:t>
+      </w:r>
+      <w:r>
+        <w:t>Personas and Representative Questions</w:t>
       </w:r>
     </w:p>
     <w:p/>
@@ -3150,6 +4467,14 @@
       <w:tblPr>
         <w:tblStyle w:val="TableGrid"/>
         <w:tblW w:w="0" w:type="auto"/>
+        <w:tblBorders>
+          <w:top w:val="double" w:sz="4" w:space="0" w:color="auto"/>
+          <w:left w:val="double" w:sz="4" w:space="0" w:color="auto"/>
+          <w:bottom w:val="double" w:sz="4" w:space="0" w:color="auto"/>
+          <w:right w:val="double" w:sz="4" w:space="0" w:color="auto"/>
+          <w:insideH w:val="double" w:sz="4" w:space="0" w:color="auto"/>
+          <w:insideV w:val="double" w:sz="4" w:space="0" w:color="auto"/>
+        </w:tblBorders>
         <w:tblLook w:val="04A0" w:firstRow="1" w:lastRow="0" w:firstColumn="1" w:lastColumn="0" w:noHBand="0" w:noVBand="1"/>
       </w:tblPr>
       <w:tblGrid>
@@ -3239,12 +4564,16 @@
           <w:p>
             <w:pPr>
               <w:rPr>
+                <w:b/>
+                <w:bCs/>
                 <w:sz w:val="24"/>
                 <w:szCs w:val="24"/>
               </w:rPr>
             </w:pPr>
             <w:r>
               <w:rPr>
+                <w:b/>
+                <w:bCs/>
                 <w:sz w:val="24"/>
                 <w:szCs w:val="24"/>
               </w:rPr>
@@ -3271,11 +4600,6 @@
               <w:t>Which products use Equipment EQ-101? Which Work Center owns Equipment EQ-101?</w:t>
             </w:r>
           </w:p>
-        </w:tc>
-        <w:tc>
-          <w:tcPr>
-            <w:tcW w:w="2880" w:type="dxa"/>
-          </w:tcPr>
           <w:p>
             <w:pPr>
               <w:rPr>
@@ -3283,35 +4607,6 @@
                 <w:szCs w:val="24"/>
               </w:rPr>
             </w:pPr>
-            <w:r>
-              <w:rPr>
-                <w:sz w:val="24"/>
-                <w:szCs w:val="24"/>
-              </w:rPr>
-              <w:t>Engineering dependency analysis</w:t>
-            </w:r>
-          </w:p>
-        </w:tc>
-      </w:tr>
-      <w:tr>
-        <w:tc>
-          <w:tcPr>
-            <w:tcW w:w="2880" w:type="dxa"/>
-          </w:tcPr>
-          <w:p>
-            <w:pPr>
-              <w:rPr>
-                <w:sz w:val="24"/>
-                <w:szCs w:val="24"/>
-              </w:rPr>
-            </w:pPr>
-            <w:r>
-              <w:rPr>
-                <w:sz w:val="24"/>
-                <w:szCs w:val="24"/>
-              </w:rPr>
-              <w:t>Maintenance Engineer</w:t>
-            </w:r>
           </w:p>
         </w:tc>
         <w:tc>
@@ -3330,7 +4625,33 @@
                 <w:sz w:val="24"/>
                 <w:szCs w:val="24"/>
               </w:rPr>
-              <w:t>If Equipment EQ-101 is unavailable, which Work Orders and Customers are affected?</w:t>
+              <w:t>Engineering dependency analysis</w:t>
+            </w:r>
+          </w:p>
+        </w:tc>
+      </w:tr>
+      <w:tr>
+        <w:tc>
+          <w:tcPr>
+            <w:tcW w:w="2880" w:type="dxa"/>
+          </w:tcPr>
+          <w:p>
+            <w:pPr>
+              <w:rPr>
+                <w:b/>
+                <w:bCs/>
+                <w:sz w:val="24"/>
+                <w:szCs w:val="24"/>
+              </w:rPr>
+            </w:pPr>
+            <w:r>
+              <w:rPr>
+                <w:b/>
+                <w:bCs/>
+                <w:sz w:val="24"/>
+                <w:szCs w:val="24"/>
+              </w:rPr>
+              <w:t>Maintenance Engineer</w:t>
             </w:r>
           </w:p>
         </w:tc>
@@ -3350,16 +4671,9 @@
                 <w:sz w:val="24"/>
                 <w:szCs w:val="24"/>
               </w:rPr>
-              <w:t>Maintenance planning</w:t>
+              <w:t>If Equipment EQ-101 is unavailable, which Work Orders and Customers are affected?</w:t>
             </w:r>
           </w:p>
-        </w:tc>
-      </w:tr>
-      <w:tr>
-        <w:tc>
-          <w:tcPr>
-            <w:tcW w:w="2880" w:type="dxa"/>
-          </w:tcPr>
           <w:p>
             <w:pPr>
               <w:rPr>
@@ -3367,13 +4681,6 @@
                 <w:szCs w:val="24"/>
               </w:rPr>
             </w:pPr>
-            <w:r>
-              <w:rPr>
-                <w:sz w:val="24"/>
-                <w:szCs w:val="24"/>
-              </w:rPr>
-              <w:t>Production Planner</w:t>
-            </w:r>
           </w:p>
         </w:tc>
         <w:tc>
@@ -3392,7 +4699,33 @@
                 <w:sz w:val="24"/>
                 <w:szCs w:val="24"/>
               </w:rPr>
-              <w:t>Which high-priority Work Orders execute on Equipment EQ-101?</w:t>
+              <w:t>Maintenance planning</w:t>
+            </w:r>
+          </w:p>
+        </w:tc>
+      </w:tr>
+      <w:tr>
+        <w:tc>
+          <w:tcPr>
+            <w:tcW w:w="2880" w:type="dxa"/>
+          </w:tcPr>
+          <w:p>
+            <w:pPr>
+              <w:rPr>
+                <w:b/>
+                <w:bCs/>
+                <w:sz w:val="24"/>
+                <w:szCs w:val="24"/>
+              </w:rPr>
+            </w:pPr>
+            <w:r>
+              <w:rPr>
+                <w:b/>
+                <w:bCs/>
+                <w:sz w:val="24"/>
+                <w:szCs w:val="24"/>
+              </w:rPr>
+              <w:t>Production Planner</w:t>
             </w:r>
           </w:p>
         </w:tc>
@@ -3412,16 +4745,9 @@
                 <w:sz w:val="24"/>
                 <w:szCs w:val="24"/>
               </w:rPr>
-              <w:t>Production prioritization</w:t>
+              <w:t>Which high-priority Work Orders execute on Equipment EQ-101?</w:t>
             </w:r>
           </w:p>
-        </w:tc>
-      </w:tr>
-      <w:tr>
-        <w:tc>
-          <w:tcPr>
-            <w:tcW w:w="2880" w:type="dxa"/>
-          </w:tcPr>
           <w:p>
             <w:pPr>
               <w:rPr>
@@ -3429,13 +4755,6 @@
                 <w:szCs w:val="24"/>
               </w:rPr>
             </w:pPr>
-            <w:r>
-              <w:rPr>
-                <w:sz w:val="24"/>
-                <w:szCs w:val="24"/>
-              </w:rPr>
-              <w:t>Plant Manager</w:t>
-            </w:r>
           </w:p>
         </w:tc>
         <w:tc>
@@ -3454,7 +4773,33 @@
                 <w:sz w:val="24"/>
                 <w:szCs w:val="24"/>
               </w:rPr>
-              <w:t>Which equipment is business critical? Which equipment supports the highest revenue?</w:t>
+              <w:t>Production prioritization</w:t>
+            </w:r>
+          </w:p>
+        </w:tc>
+      </w:tr>
+      <w:tr>
+        <w:tc>
+          <w:tcPr>
+            <w:tcW w:w="2880" w:type="dxa"/>
+          </w:tcPr>
+          <w:p>
+            <w:pPr>
+              <w:rPr>
+                <w:b/>
+                <w:bCs/>
+                <w:sz w:val="24"/>
+                <w:szCs w:val="24"/>
+              </w:rPr>
+            </w:pPr>
+            <w:r>
+              <w:rPr>
+                <w:b/>
+                <w:bCs/>
+                <w:sz w:val="24"/>
+                <w:szCs w:val="24"/>
+              </w:rPr>
+              <w:t>Plant Manager</w:t>
             </w:r>
           </w:p>
         </w:tc>
@@ -3474,16 +4819,9 @@
                 <w:sz w:val="24"/>
                 <w:szCs w:val="24"/>
               </w:rPr>
-              <w:t>Operational visibility</w:t>
+              <w:t>Which equipment is business critical? Which equipment supports the highest revenue?</w:t>
             </w:r>
           </w:p>
-        </w:tc>
-      </w:tr>
-      <w:tr>
-        <w:tc>
-          <w:tcPr>
-            <w:tcW w:w="2880" w:type="dxa"/>
-          </w:tcPr>
           <w:p>
             <w:pPr>
               <w:rPr>
@@ -3491,13 +4829,6 @@
                 <w:szCs w:val="24"/>
               </w:rPr>
             </w:pPr>
-            <w:r>
-              <w:rPr>
-                <w:sz w:val="24"/>
-                <w:szCs w:val="24"/>
-              </w:rPr>
-              <w:t>Executive</w:t>
-            </w:r>
           </w:p>
         </w:tc>
         <w:tc>
@@ -3516,7 +4847,33 @@
                 <w:sz w:val="24"/>
                 <w:szCs w:val="24"/>
               </w:rPr>
-              <w:t>Which manufacturing assets represent the highest revenue exposure?</w:t>
+              <w:t>Operational visibility</w:t>
+            </w:r>
+          </w:p>
+        </w:tc>
+      </w:tr>
+      <w:tr>
+        <w:tc>
+          <w:tcPr>
+            <w:tcW w:w="2880" w:type="dxa"/>
+          </w:tcPr>
+          <w:p>
+            <w:pPr>
+              <w:rPr>
+                <w:b/>
+                <w:bCs/>
+                <w:sz w:val="24"/>
+                <w:szCs w:val="24"/>
+              </w:rPr>
+            </w:pPr>
+            <w:r>
+              <w:rPr>
+                <w:b/>
+                <w:bCs/>
+                <w:sz w:val="24"/>
+                <w:szCs w:val="24"/>
+              </w:rPr>
+              <w:t>Executive</w:t>
             </w:r>
           </w:p>
         </w:tc>
@@ -3536,16 +4893,9 @@
                 <w:sz w:val="24"/>
                 <w:szCs w:val="24"/>
               </w:rPr>
-              <w:t>Strategic decisions</w:t>
+              <w:t>Which manufacturing assets represent the highest revenue exposure?</w:t>
             </w:r>
           </w:p>
-        </w:tc>
-      </w:tr>
-      <w:tr>
-        <w:tc>
-          <w:tcPr>
-            <w:tcW w:w="2880" w:type="dxa"/>
-          </w:tcPr>
           <w:p>
             <w:pPr>
               <w:rPr>
@@ -3553,13 +4903,6 @@
                 <w:szCs w:val="24"/>
               </w:rPr>
             </w:pPr>
-            <w:r>
-              <w:rPr>
-                <w:sz w:val="24"/>
-                <w:szCs w:val="24"/>
-              </w:rPr>
-              <w:t>Manufacturing Impact Copilot</w:t>
-            </w:r>
           </w:p>
         </w:tc>
         <w:tc>
@@ -3578,7 +4921,33 @@
                 <w:sz w:val="24"/>
                 <w:szCs w:val="24"/>
               </w:rPr>
-              <w:t>Explain why Equipment EQ-101 is business critical.</w:t>
+              <w:t>Strategic decisions</w:t>
+            </w:r>
+          </w:p>
+        </w:tc>
+      </w:tr>
+      <w:tr>
+        <w:tc>
+          <w:tcPr>
+            <w:tcW w:w="2880" w:type="dxa"/>
+          </w:tcPr>
+          <w:p>
+            <w:pPr>
+              <w:rPr>
+                <w:b/>
+                <w:bCs/>
+                <w:sz w:val="24"/>
+                <w:szCs w:val="24"/>
+              </w:rPr>
+            </w:pPr>
+            <w:r>
+              <w:rPr>
+                <w:b/>
+                <w:bCs/>
+                <w:sz w:val="24"/>
+                <w:szCs w:val="24"/>
+              </w:rPr>
+              <w:t>Manufacturing Impact Copilot</w:t>
             </w:r>
           </w:p>
         </w:tc>
@@ -3598,7 +4967,981 @@
                 <w:sz w:val="24"/>
                 <w:szCs w:val="24"/>
               </w:rPr>
+              <w:t>Explain why Equipment EQ-101 is business critical.</w:t>
+            </w:r>
+          </w:p>
+          <w:p>
+            <w:pPr>
+              <w:rPr>
+                <w:sz w:val="24"/>
+                <w:szCs w:val="24"/>
+              </w:rPr>
+            </w:pPr>
+          </w:p>
+        </w:tc>
+        <w:tc>
+          <w:tcPr>
+            <w:tcW w:w="2880" w:type="dxa"/>
+          </w:tcPr>
+          <w:p>
+            <w:pPr>
+              <w:rPr>
+                <w:sz w:val="24"/>
+                <w:szCs w:val="24"/>
+              </w:rPr>
+            </w:pPr>
+            <w:r>
+              <w:rPr>
+                <w:sz w:val="24"/>
+                <w:szCs w:val="24"/>
+              </w:rPr>
               <w:t>Natural-language explanation</w:t>
+            </w:r>
+          </w:p>
+        </w:tc>
+      </w:tr>
+    </w:tbl>
+    <w:p/>
+    <w:p/>
+    <w:p/>
+    <w:p/>
+    <w:p/>
+    <w:p/>
+    <w:p>
+      <w:pPr>
+        <w:pStyle w:val="Heading2"/>
+      </w:pPr>
+      <w:r>
+        <w:lastRenderedPageBreak/>
+        <w:t>1</w:t>
+      </w:r>
+      <w:r>
+        <w:t>1</w:t>
+      </w:r>
+      <w:r>
+        <w:t xml:space="preserve">. </w:t>
+      </w:r>
+      <w:r>
+        <w:t>Work Center Impact Analysis</w:t>
+      </w:r>
+      <w:r>
+        <w:t xml:space="preserve"> - </w:t>
+      </w:r>
+      <w:r>
+        <w:t>Personas and Representative Questions</w:t>
+      </w:r>
+    </w:p>
+    <w:p/>
+    <w:tbl>
+      <w:tblPr>
+        <w:tblW w:w="0" w:type="auto"/>
+        <w:tblCellSpacing w:w="15" w:type="dxa"/>
+        <w:tblBorders>
+          <w:top w:val="single" w:sz="4" w:space="0" w:color="auto"/>
+          <w:left w:val="single" w:sz="4" w:space="0" w:color="auto"/>
+          <w:bottom w:val="single" w:sz="4" w:space="0" w:color="auto"/>
+          <w:right w:val="single" w:sz="4" w:space="0" w:color="auto"/>
+          <w:insideH w:val="single" w:sz="4" w:space="0" w:color="auto"/>
+          <w:insideV w:val="single" w:sz="4" w:space="0" w:color="auto"/>
+        </w:tblBorders>
+        <w:tblCellMar>
+          <w:top w:w="15" w:type="dxa"/>
+          <w:left w:w="15" w:type="dxa"/>
+          <w:bottom w:w="15" w:type="dxa"/>
+          <w:right w:w="15" w:type="dxa"/>
+        </w:tblCellMar>
+        <w:tblLook w:val="04A0" w:firstRow="1" w:lastRow="0" w:firstColumn="1" w:lastColumn="0" w:noHBand="0" w:noVBand="1"/>
+      </w:tblPr>
+      <w:tblGrid>
+        <w:gridCol w:w="1964"/>
+        <w:gridCol w:w="3772"/>
+        <w:gridCol w:w="3014"/>
+      </w:tblGrid>
+      <w:tr>
+        <w:trPr>
+          <w:tblHeader/>
+          <w:tblCellSpacing w:w="15" w:type="dxa"/>
+        </w:trPr>
+        <w:tc>
+          <w:tcPr>
+            <w:tcW w:w="0" w:type="auto"/>
+            <w:vAlign w:val="center"/>
+            <w:hideMark/>
+          </w:tcPr>
+          <w:p>
+            <w:pPr>
+              <w:rPr>
+                <w:b/>
+                <w:bCs/>
+                <w:sz w:val="24"/>
+                <w:szCs w:val="24"/>
+                <w:lang w:val="en-IN"/>
+              </w:rPr>
+            </w:pPr>
+            <w:r>
+              <w:rPr>
+                <w:b/>
+                <w:bCs/>
+                <w:sz w:val="24"/>
+                <w:szCs w:val="24"/>
+                <w:lang w:val="en-IN"/>
+              </w:rPr>
+              <w:t>Persona</w:t>
+            </w:r>
+          </w:p>
+        </w:tc>
+        <w:tc>
+          <w:tcPr>
+            <w:tcW w:w="0" w:type="auto"/>
+            <w:vAlign w:val="center"/>
+            <w:hideMark/>
+          </w:tcPr>
+          <w:p>
+            <w:pPr>
+              <w:rPr>
+                <w:b/>
+                <w:bCs/>
+                <w:sz w:val="24"/>
+                <w:szCs w:val="24"/>
+                <w:lang w:val="en-IN"/>
+              </w:rPr>
+            </w:pPr>
+            <w:r>
+              <w:rPr>
+                <w:b/>
+                <w:bCs/>
+                <w:sz w:val="24"/>
+                <w:szCs w:val="24"/>
+                <w:lang w:val="en-IN"/>
+              </w:rPr>
+              <w:t>Business Question</w:t>
+            </w:r>
+          </w:p>
+        </w:tc>
+        <w:tc>
+          <w:tcPr>
+            <w:tcW w:w="0" w:type="auto"/>
+            <w:vAlign w:val="center"/>
+            <w:hideMark/>
+          </w:tcPr>
+          <w:p>
+            <w:pPr>
+              <w:rPr>
+                <w:b/>
+                <w:bCs/>
+                <w:sz w:val="24"/>
+                <w:szCs w:val="24"/>
+                <w:lang w:val="en-IN"/>
+              </w:rPr>
+            </w:pPr>
+            <w:r>
+              <w:rPr>
+                <w:b/>
+                <w:bCs/>
+                <w:sz w:val="24"/>
+                <w:szCs w:val="24"/>
+                <w:lang w:val="en-IN"/>
+              </w:rPr>
+              <w:t>Business Value</w:t>
+            </w:r>
+          </w:p>
+        </w:tc>
+      </w:tr>
+      <w:tr>
+        <w:trPr>
+          <w:tblCellSpacing w:w="15" w:type="dxa"/>
+        </w:trPr>
+        <w:tc>
+          <w:tcPr>
+            <w:tcW w:w="0" w:type="auto"/>
+            <w:vAlign w:val="center"/>
+            <w:hideMark/>
+          </w:tcPr>
+          <w:p>
+            <w:pPr>
+              <w:rPr>
+                <w:sz w:val="24"/>
+                <w:szCs w:val="24"/>
+                <w:lang w:val="en-IN"/>
+              </w:rPr>
+            </w:pPr>
+            <w:r>
+              <w:rPr>
+                <w:b/>
+                <w:bCs/>
+                <w:sz w:val="24"/>
+                <w:szCs w:val="24"/>
+                <w:lang w:val="en-IN"/>
+              </w:rPr>
+              <w:t>Production Planner</w:t>
+            </w:r>
+          </w:p>
+        </w:tc>
+        <w:tc>
+          <w:tcPr>
+            <w:tcW w:w="0" w:type="auto"/>
+            <w:vAlign w:val="center"/>
+            <w:hideMark/>
+          </w:tcPr>
+          <w:p>
+            <w:pPr>
+              <w:rPr>
+                <w:sz w:val="24"/>
+                <w:szCs w:val="24"/>
+                <w:lang w:val="en-IN"/>
+              </w:rPr>
+            </w:pPr>
+            <w:r>
+              <w:rPr>
+                <w:sz w:val="24"/>
+                <w:szCs w:val="24"/>
+                <w:lang w:val="en-IN"/>
+              </w:rPr>
+              <w:t xml:space="preserve">Which Work Orders are scheduled to execute at Work </w:t>
+            </w:r>
+            <w:proofErr w:type="spellStart"/>
+            <w:r>
+              <w:rPr>
+                <w:sz w:val="24"/>
+                <w:szCs w:val="24"/>
+                <w:lang w:val="en-IN"/>
+              </w:rPr>
+              <w:t>Cent</w:t>
+            </w:r>
+            <w:r>
+              <w:rPr>
+                <w:sz w:val="24"/>
+                <w:szCs w:val="24"/>
+                <w:lang w:val="en-IN"/>
+              </w:rPr>
+              <w:t>er</w:t>
+            </w:r>
+            <w:proofErr w:type="spellEnd"/>
+            <w:r>
+              <w:rPr>
+                <w:sz w:val="24"/>
+                <w:szCs w:val="24"/>
+                <w:lang w:val="en-IN"/>
+              </w:rPr>
+              <w:t xml:space="preserve"> </w:t>
+            </w:r>
+            <w:r>
+              <w:rPr>
+                <w:b/>
+                <w:bCs/>
+                <w:sz w:val="24"/>
+                <w:szCs w:val="24"/>
+                <w:lang w:val="en-IN"/>
+              </w:rPr>
+              <w:t>SMT Assembly</w:t>
+            </w:r>
+            <w:r>
+              <w:rPr>
+                <w:sz w:val="24"/>
+                <w:szCs w:val="24"/>
+                <w:lang w:val="en-IN"/>
+              </w:rPr>
+              <w:t>?</w:t>
+            </w:r>
+          </w:p>
+        </w:tc>
+        <w:tc>
+          <w:tcPr>
+            <w:tcW w:w="0" w:type="auto"/>
+            <w:vAlign w:val="center"/>
+            <w:hideMark/>
+          </w:tcPr>
+          <w:p>
+            <w:pPr>
+              <w:rPr>
+                <w:sz w:val="24"/>
+                <w:szCs w:val="24"/>
+                <w:lang w:val="en-IN"/>
+              </w:rPr>
+            </w:pPr>
+            <w:r>
+              <w:rPr>
+                <w:sz w:val="24"/>
+                <w:szCs w:val="24"/>
+                <w:lang w:val="en-IN"/>
+              </w:rPr>
+              <w:t>Understand production dependency before scheduling maintenance or downtime.</w:t>
+            </w:r>
+          </w:p>
+        </w:tc>
+      </w:tr>
+      <w:tr>
+        <w:trPr>
+          <w:tblCellSpacing w:w="15" w:type="dxa"/>
+        </w:trPr>
+        <w:tc>
+          <w:tcPr>
+            <w:tcW w:w="0" w:type="auto"/>
+            <w:vAlign w:val="center"/>
+            <w:hideMark/>
+          </w:tcPr>
+          <w:p>
+            <w:pPr>
+              <w:rPr>
+                <w:sz w:val="24"/>
+                <w:szCs w:val="24"/>
+                <w:lang w:val="en-IN"/>
+              </w:rPr>
+            </w:pPr>
+            <w:r>
+              <w:rPr>
+                <w:b/>
+                <w:bCs/>
+                <w:sz w:val="24"/>
+                <w:szCs w:val="24"/>
+                <w:lang w:val="en-IN"/>
+              </w:rPr>
+              <w:t>Production Planner</w:t>
+            </w:r>
+          </w:p>
+        </w:tc>
+        <w:tc>
+          <w:tcPr>
+            <w:tcW w:w="0" w:type="auto"/>
+            <w:vAlign w:val="center"/>
+            <w:hideMark/>
+          </w:tcPr>
+          <w:p>
+            <w:pPr>
+              <w:rPr>
+                <w:sz w:val="24"/>
+                <w:szCs w:val="24"/>
+                <w:lang w:val="en-IN"/>
+              </w:rPr>
+            </w:pPr>
+            <w:r>
+              <w:rPr>
+                <w:sz w:val="24"/>
+                <w:szCs w:val="24"/>
+                <w:lang w:val="en-IN"/>
+              </w:rPr>
+              <w:t xml:space="preserve">What is the impact if Work </w:t>
+            </w:r>
+            <w:proofErr w:type="spellStart"/>
+            <w:r>
+              <w:rPr>
+                <w:sz w:val="24"/>
+                <w:szCs w:val="24"/>
+                <w:lang w:val="en-IN"/>
+              </w:rPr>
+              <w:t>Cent</w:t>
+            </w:r>
+            <w:r>
+              <w:rPr>
+                <w:sz w:val="24"/>
+                <w:szCs w:val="24"/>
+                <w:lang w:val="en-IN"/>
+              </w:rPr>
+              <w:t>er</w:t>
+            </w:r>
+            <w:proofErr w:type="spellEnd"/>
+            <w:r>
+              <w:rPr>
+                <w:sz w:val="24"/>
+                <w:szCs w:val="24"/>
+                <w:lang w:val="en-IN"/>
+              </w:rPr>
+              <w:t xml:space="preserve"> </w:t>
+            </w:r>
+            <w:r>
+              <w:rPr>
+                <w:b/>
+                <w:bCs/>
+                <w:sz w:val="24"/>
+                <w:szCs w:val="24"/>
+                <w:lang w:val="en-IN"/>
+              </w:rPr>
+              <w:t>CNC Machining</w:t>
+            </w:r>
+            <w:r>
+              <w:rPr>
+                <w:sz w:val="24"/>
+                <w:szCs w:val="24"/>
+                <w:lang w:val="en-IN"/>
+              </w:rPr>
+              <w:t xml:space="preserve"> becomes unavailable?</w:t>
+            </w:r>
+          </w:p>
+        </w:tc>
+        <w:tc>
+          <w:tcPr>
+            <w:tcW w:w="0" w:type="auto"/>
+            <w:vAlign w:val="center"/>
+            <w:hideMark/>
+          </w:tcPr>
+          <w:p>
+            <w:pPr>
+              <w:rPr>
+                <w:sz w:val="24"/>
+                <w:szCs w:val="24"/>
+                <w:lang w:val="en-IN"/>
+              </w:rPr>
+            </w:pPr>
+            <w:r>
+              <w:rPr>
+                <w:sz w:val="24"/>
+                <w:szCs w:val="24"/>
+                <w:lang w:val="en-IN"/>
+              </w:rPr>
+              <w:t>Quickly identify affected production orders and reschedule manufacturing operations.</w:t>
+            </w:r>
+          </w:p>
+        </w:tc>
+      </w:tr>
+      <w:tr>
+        <w:trPr>
+          <w:tblCellSpacing w:w="15" w:type="dxa"/>
+        </w:trPr>
+        <w:tc>
+          <w:tcPr>
+            <w:tcW w:w="0" w:type="auto"/>
+            <w:vAlign w:val="center"/>
+            <w:hideMark/>
+          </w:tcPr>
+          <w:p>
+            <w:pPr>
+              <w:rPr>
+                <w:sz w:val="24"/>
+                <w:szCs w:val="24"/>
+                <w:lang w:val="en-IN"/>
+              </w:rPr>
+            </w:pPr>
+            <w:r>
+              <w:rPr>
+                <w:b/>
+                <w:bCs/>
+                <w:sz w:val="24"/>
+                <w:szCs w:val="24"/>
+                <w:lang w:val="en-IN"/>
+              </w:rPr>
+              <w:t>Manufacturing Manager</w:t>
+            </w:r>
+          </w:p>
+        </w:tc>
+        <w:tc>
+          <w:tcPr>
+            <w:tcW w:w="0" w:type="auto"/>
+            <w:vAlign w:val="center"/>
+            <w:hideMark/>
+          </w:tcPr>
+          <w:p>
+            <w:pPr>
+              <w:rPr>
+                <w:sz w:val="24"/>
+                <w:szCs w:val="24"/>
+                <w:lang w:val="en-IN"/>
+              </w:rPr>
+            </w:pPr>
+            <w:r>
+              <w:rPr>
+                <w:sz w:val="24"/>
+                <w:szCs w:val="24"/>
+                <w:lang w:val="en-IN"/>
+              </w:rPr>
+              <w:t>Which Products</w:t>
+            </w:r>
+            <w:r>
+              <w:rPr>
+                <w:sz w:val="24"/>
+                <w:szCs w:val="24"/>
+                <w:lang w:val="en-IN"/>
+              </w:rPr>
+              <w:t>/Operations</w:t>
+            </w:r>
+            <w:r>
+              <w:rPr>
+                <w:sz w:val="24"/>
+                <w:szCs w:val="24"/>
+                <w:lang w:val="en-IN"/>
+              </w:rPr>
+              <w:t xml:space="preserve"> depend on Work </w:t>
+            </w:r>
+            <w:proofErr w:type="spellStart"/>
+            <w:r>
+              <w:rPr>
+                <w:sz w:val="24"/>
+                <w:szCs w:val="24"/>
+                <w:lang w:val="en-IN"/>
+              </w:rPr>
+              <w:t>Center</w:t>
+            </w:r>
+            <w:proofErr w:type="spellEnd"/>
+            <w:r>
+              <w:rPr>
+                <w:sz w:val="24"/>
+                <w:szCs w:val="24"/>
+                <w:lang w:val="en-IN"/>
+              </w:rPr>
+              <w:t xml:space="preserve"> </w:t>
+            </w:r>
+            <w:r>
+              <w:rPr>
+                <w:b/>
+                <w:bCs/>
+                <w:sz w:val="24"/>
+                <w:szCs w:val="24"/>
+                <w:lang w:val="en-IN"/>
+              </w:rPr>
+              <w:t>Assembly Line A</w:t>
+            </w:r>
+            <w:r>
+              <w:rPr>
+                <w:sz w:val="24"/>
+                <w:szCs w:val="24"/>
+                <w:lang w:val="en-IN"/>
+              </w:rPr>
+              <w:t>?</w:t>
+            </w:r>
+          </w:p>
+        </w:tc>
+        <w:tc>
+          <w:tcPr>
+            <w:tcW w:w="0" w:type="auto"/>
+            <w:vAlign w:val="center"/>
+            <w:hideMark/>
+          </w:tcPr>
+          <w:p>
+            <w:pPr>
+              <w:rPr>
+                <w:sz w:val="24"/>
+                <w:szCs w:val="24"/>
+                <w:lang w:val="en-IN"/>
+              </w:rPr>
+            </w:pPr>
+            <w:r>
+              <w:rPr>
+                <w:sz w:val="24"/>
+                <w:szCs w:val="24"/>
+                <w:lang w:val="en-IN"/>
+              </w:rPr>
+              <w:t>Assess production risk and prioritize recovery activities.</w:t>
+            </w:r>
+          </w:p>
+        </w:tc>
+      </w:tr>
+      <w:tr>
+        <w:trPr>
+          <w:tblCellSpacing w:w="15" w:type="dxa"/>
+        </w:trPr>
+        <w:tc>
+          <w:tcPr>
+            <w:tcW w:w="0" w:type="auto"/>
+            <w:vAlign w:val="center"/>
+            <w:hideMark/>
+          </w:tcPr>
+          <w:p>
+            <w:pPr>
+              <w:rPr>
+                <w:sz w:val="24"/>
+                <w:szCs w:val="24"/>
+                <w:lang w:val="en-IN"/>
+              </w:rPr>
+            </w:pPr>
+            <w:r>
+              <w:rPr>
+                <w:b/>
+                <w:bCs/>
+                <w:sz w:val="24"/>
+                <w:szCs w:val="24"/>
+                <w:lang w:val="en-IN"/>
+              </w:rPr>
+              <w:t>Operations Manager</w:t>
+            </w:r>
+          </w:p>
+        </w:tc>
+        <w:tc>
+          <w:tcPr>
+            <w:tcW w:w="0" w:type="auto"/>
+            <w:vAlign w:val="center"/>
+            <w:hideMark/>
+          </w:tcPr>
+          <w:p>
+            <w:pPr>
+              <w:rPr>
+                <w:sz w:val="24"/>
+                <w:szCs w:val="24"/>
+                <w:lang w:val="en-IN"/>
+              </w:rPr>
+            </w:pPr>
+            <w:r>
+              <w:rPr>
+                <w:sz w:val="24"/>
+                <w:szCs w:val="24"/>
+                <w:lang w:val="en-IN"/>
+              </w:rPr>
+              <w:t>Which Customers</w:t>
+            </w:r>
+            <w:r>
+              <w:rPr>
+                <w:sz w:val="24"/>
+                <w:szCs w:val="24"/>
+                <w:lang w:val="en-IN"/>
+              </w:rPr>
+              <w:t>/Sales Orders</w:t>
+            </w:r>
+            <w:r>
+              <w:rPr>
+                <w:sz w:val="24"/>
+                <w:szCs w:val="24"/>
+                <w:lang w:val="en-IN"/>
+              </w:rPr>
+              <w:t xml:space="preserve"> are impacted if Work </w:t>
+            </w:r>
+            <w:proofErr w:type="spellStart"/>
+            <w:r>
+              <w:rPr>
+                <w:sz w:val="24"/>
+                <w:szCs w:val="24"/>
+                <w:lang w:val="en-IN"/>
+              </w:rPr>
+              <w:t>Center</w:t>
+            </w:r>
+            <w:proofErr w:type="spellEnd"/>
+            <w:r>
+              <w:rPr>
+                <w:sz w:val="24"/>
+                <w:szCs w:val="24"/>
+                <w:lang w:val="en-IN"/>
+              </w:rPr>
+              <w:t xml:space="preserve"> </w:t>
+            </w:r>
+            <w:r>
+              <w:rPr>
+                <w:b/>
+                <w:bCs/>
+                <w:sz w:val="24"/>
+                <w:szCs w:val="24"/>
+                <w:lang w:val="en-IN"/>
+              </w:rPr>
+              <w:t>SMT Assembly</w:t>
+            </w:r>
+            <w:r>
+              <w:rPr>
+                <w:sz w:val="24"/>
+                <w:szCs w:val="24"/>
+                <w:lang w:val="en-IN"/>
+              </w:rPr>
+              <w:t xml:space="preserve"> is unavailable?</w:t>
+            </w:r>
+          </w:p>
+        </w:tc>
+        <w:tc>
+          <w:tcPr>
+            <w:tcW w:w="0" w:type="auto"/>
+            <w:vAlign w:val="center"/>
+            <w:hideMark/>
+          </w:tcPr>
+          <w:p>
+            <w:pPr>
+              <w:rPr>
+                <w:sz w:val="24"/>
+                <w:szCs w:val="24"/>
+                <w:lang w:val="en-IN"/>
+              </w:rPr>
+            </w:pPr>
+            <w:r>
+              <w:rPr>
+                <w:sz w:val="24"/>
+                <w:szCs w:val="24"/>
+                <w:lang w:val="en-IN"/>
+              </w:rPr>
+              <w:t>Determine customer commitments at risk and initiate mitigation actions.</w:t>
+            </w:r>
+          </w:p>
+        </w:tc>
+      </w:tr>
+      <w:tr>
+        <w:trPr>
+          <w:tblCellSpacing w:w="15" w:type="dxa"/>
+        </w:trPr>
+        <w:tc>
+          <w:tcPr>
+            <w:tcW w:w="0" w:type="auto"/>
+            <w:vAlign w:val="center"/>
+            <w:hideMark/>
+          </w:tcPr>
+          <w:p>
+            <w:pPr>
+              <w:rPr>
+                <w:sz w:val="24"/>
+                <w:szCs w:val="24"/>
+                <w:lang w:val="en-IN"/>
+              </w:rPr>
+            </w:pPr>
+            <w:r>
+              <w:rPr>
+                <w:b/>
+                <w:bCs/>
+                <w:sz w:val="24"/>
+                <w:szCs w:val="24"/>
+                <w:lang w:val="en-IN"/>
+              </w:rPr>
+              <w:t>Maintenance Planner</w:t>
+            </w:r>
+          </w:p>
+        </w:tc>
+        <w:tc>
+          <w:tcPr>
+            <w:tcW w:w="0" w:type="auto"/>
+            <w:vAlign w:val="center"/>
+            <w:hideMark/>
+          </w:tcPr>
+          <w:p>
+            <w:pPr>
+              <w:rPr>
+                <w:sz w:val="24"/>
+                <w:szCs w:val="24"/>
+                <w:lang w:val="en-IN"/>
+              </w:rPr>
+            </w:pPr>
+            <w:r>
+              <w:rPr>
+                <w:sz w:val="24"/>
+                <w:szCs w:val="24"/>
+                <w:lang w:val="en-IN"/>
+              </w:rPr>
+              <w:t xml:space="preserve">Which active Work Orders will be impacted if a Work </w:t>
+            </w:r>
+            <w:proofErr w:type="spellStart"/>
+            <w:r>
+              <w:rPr>
+                <w:sz w:val="24"/>
+                <w:szCs w:val="24"/>
+                <w:lang w:val="en-IN"/>
+              </w:rPr>
+              <w:t>Center</w:t>
+            </w:r>
+            <w:proofErr w:type="spellEnd"/>
+            <w:r>
+              <w:rPr>
+                <w:sz w:val="24"/>
+                <w:szCs w:val="24"/>
+                <w:lang w:val="en-IN"/>
+              </w:rPr>
+              <w:t xml:space="preserve"> is taken offline for planned maintenance?</w:t>
+            </w:r>
+          </w:p>
+        </w:tc>
+        <w:tc>
+          <w:tcPr>
+            <w:tcW w:w="0" w:type="auto"/>
+            <w:vAlign w:val="center"/>
+            <w:hideMark/>
+          </w:tcPr>
+          <w:p>
+            <w:pPr>
+              <w:rPr>
+                <w:sz w:val="24"/>
+                <w:szCs w:val="24"/>
+                <w:lang w:val="en-IN"/>
+              </w:rPr>
+            </w:pPr>
+            <w:r>
+              <w:rPr>
+                <w:sz w:val="24"/>
+                <w:szCs w:val="24"/>
+                <w:lang w:val="en-IN"/>
+              </w:rPr>
+              <w:t>Schedule maintenance with minimal disruption to production.</w:t>
+            </w:r>
+          </w:p>
+        </w:tc>
+      </w:tr>
+      <w:tr>
+        <w:trPr>
+          <w:tblCellSpacing w:w="15" w:type="dxa"/>
+        </w:trPr>
+        <w:tc>
+          <w:tcPr>
+            <w:tcW w:w="0" w:type="auto"/>
+            <w:vAlign w:val="center"/>
+            <w:hideMark/>
+          </w:tcPr>
+          <w:p>
+            <w:pPr>
+              <w:rPr>
+                <w:sz w:val="24"/>
+                <w:szCs w:val="24"/>
+                <w:lang w:val="en-IN"/>
+              </w:rPr>
+            </w:pPr>
+            <w:r>
+              <w:rPr>
+                <w:b/>
+                <w:bCs/>
+                <w:sz w:val="24"/>
+                <w:szCs w:val="24"/>
+                <w:lang w:val="en-IN"/>
+              </w:rPr>
+              <w:t>Customer Service Manager</w:t>
+            </w:r>
+          </w:p>
+        </w:tc>
+        <w:tc>
+          <w:tcPr>
+            <w:tcW w:w="0" w:type="auto"/>
+            <w:vAlign w:val="center"/>
+            <w:hideMark/>
+          </w:tcPr>
+          <w:p>
+            <w:pPr>
+              <w:rPr>
+                <w:sz w:val="24"/>
+                <w:szCs w:val="24"/>
+                <w:lang w:val="en-IN"/>
+              </w:rPr>
+            </w:pPr>
+            <w:r>
+              <w:rPr>
+                <w:sz w:val="24"/>
+                <w:szCs w:val="24"/>
+                <w:lang w:val="en-IN"/>
+              </w:rPr>
+              <w:t xml:space="preserve">Which customer deliveries are affected by a Work </w:t>
+            </w:r>
+            <w:proofErr w:type="spellStart"/>
+            <w:r>
+              <w:rPr>
+                <w:sz w:val="24"/>
+                <w:szCs w:val="24"/>
+                <w:lang w:val="en-IN"/>
+              </w:rPr>
+              <w:t>Center</w:t>
+            </w:r>
+            <w:proofErr w:type="spellEnd"/>
+            <w:r>
+              <w:rPr>
+                <w:sz w:val="24"/>
+                <w:szCs w:val="24"/>
+                <w:lang w:val="en-IN"/>
+              </w:rPr>
+              <w:t xml:space="preserve"> disruption?</w:t>
+            </w:r>
+          </w:p>
+        </w:tc>
+        <w:tc>
+          <w:tcPr>
+            <w:tcW w:w="0" w:type="auto"/>
+            <w:vAlign w:val="center"/>
+            <w:hideMark/>
+          </w:tcPr>
+          <w:p>
+            <w:pPr>
+              <w:rPr>
+                <w:sz w:val="24"/>
+                <w:szCs w:val="24"/>
+                <w:lang w:val="en-IN"/>
+              </w:rPr>
+            </w:pPr>
+            <w:r>
+              <w:rPr>
+                <w:sz w:val="24"/>
+                <w:szCs w:val="24"/>
+                <w:lang w:val="en-IN"/>
+              </w:rPr>
+              <w:t>Provide proactive customer communication and revised delivery commitments.</w:t>
+            </w:r>
+          </w:p>
+        </w:tc>
+      </w:tr>
+      <w:tr>
+        <w:trPr>
+          <w:tblCellSpacing w:w="15" w:type="dxa"/>
+        </w:trPr>
+        <w:tc>
+          <w:tcPr>
+            <w:tcW w:w="0" w:type="auto"/>
+            <w:vAlign w:val="center"/>
+            <w:hideMark/>
+          </w:tcPr>
+          <w:p>
+            <w:pPr>
+              <w:rPr>
+                <w:sz w:val="24"/>
+                <w:szCs w:val="24"/>
+                <w:lang w:val="en-IN"/>
+              </w:rPr>
+            </w:pPr>
+            <w:r>
+              <w:rPr>
+                <w:b/>
+                <w:bCs/>
+                <w:sz w:val="24"/>
+                <w:szCs w:val="24"/>
+                <w:lang w:val="en-IN"/>
+              </w:rPr>
+              <w:t>Supply Chain Manager</w:t>
+            </w:r>
+          </w:p>
+        </w:tc>
+        <w:tc>
+          <w:tcPr>
+            <w:tcW w:w="0" w:type="auto"/>
+            <w:vAlign w:val="center"/>
+            <w:hideMark/>
+          </w:tcPr>
+          <w:p>
+            <w:pPr>
+              <w:rPr>
+                <w:sz w:val="24"/>
+                <w:szCs w:val="24"/>
+                <w:lang w:val="en-IN"/>
+              </w:rPr>
+            </w:pPr>
+            <w:r>
+              <w:rPr>
+                <w:sz w:val="24"/>
+                <w:szCs w:val="24"/>
+                <w:lang w:val="en-IN"/>
+              </w:rPr>
+              <w:t xml:space="preserve">Which Purchase Orders support Work Orders executing at a disrupted Work </w:t>
+            </w:r>
+            <w:proofErr w:type="spellStart"/>
+            <w:r>
+              <w:rPr>
+                <w:sz w:val="24"/>
+                <w:szCs w:val="24"/>
+                <w:lang w:val="en-IN"/>
+              </w:rPr>
+              <w:t>Center</w:t>
+            </w:r>
+            <w:proofErr w:type="spellEnd"/>
+            <w:r>
+              <w:rPr>
+                <w:sz w:val="24"/>
+                <w:szCs w:val="24"/>
+                <w:lang w:val="en-IN"/>
+              </w:rPr>
+              <w:t>?</w:t>
+            </w:r>
+          </w:p>
+        </w:tc>
+        <w:tc>
+          <w:tcPr>
+            <w:tcW w:w="0" w:type="auto"/>
+            <w:vAlign w:val="center"/>
+            <w:hideMark/>
+          </w:tcPr>
+          <w:p>
+            <w:pPr>
+              <w:rPr>
+                <w:sz w:val="24"/>
+                <w:szCs w:val="24"/>
+                <w:lang w:val="en-IN"/>
+              </w:rPr>
+            </w:pPr>
+            <w:r>
+              <w:rPr>
+                <w:sz w:val="24"/>
+                <w:szCs w:val="24"/>
+                <w:lang w:val="en-IN"/>
+              </w:rPr>
+              <w:t>Coordinate material planning and avoid unnecessary procurement activities.</w:t>
             </w:r>
           </w:p>
         </w:tc>
@@ -3788,6 +6131,155 @@
       </w:rPr>
     </w:lvl>
   </w:abstractNum>
+  <w:abstractNum w:abstractNumId="9" w15:restartNumberingAfterBreak="0">
+    <w:nsid w:val="05B05D52"/>
+    <w:multiLevelType w:val="multilevel"/>
+    <w:tmpl w:val="B518DB64"/>
+    <w:lvl w:ilvl="0">
+      <w:start w:val="1"/>
+      <w:numFmt w:val="bullet"/>
+      <w:lvlText w:val=""/>
+      <w:lvlJc w:val="left"/>
+      <w:pPr>
+        <w:tabs>
+          <w:tab w:val="num" w:pos="720"/>
+        </w:tabs>
+        <w:ind w:left="720" w:hanging="360"/>
+      </w:pPr>
+      <w:rPr>
+        <w:rFonts w:ascii="Symbol" w:hAnsi="Symbol" w:hint="default"/>
+        <w:sz w:val="20"/>
+      </w:rPr>
+    </w:lvl>
+    <w:lvl w:ilvl="1" w:tentative="1">
+      <w:start w:val="1"/>
+      <w:numFmt w:val="bullet"/>
+      <w:lvlText w:val="o"/>
+      <w:lvlJc w:val="left"/>
+      <w:pPr>
+        <w:tabs>
+          <w:tab w:val="num" w:pos="1440"/>
+        </w:tabs>
+        <w:ind w:left="1440" w:hanging="360"/>
+      </w:pPr>
+      <w:rPr>
+        <w:rFonts w:ascii="Courier New" w:hAnsi="Courier New" w:hint="default"/>
+        <w:sz w:val="20"/>
+      </w:rPr>
+    </w:lvl>
+    <w:lvl w:ilvl="2" w:tentative="1">
+      <w:start w:val="1"/>
+      <w:numFmt w:val="bullet"/>
+      <w:lvlText w:val=""/>
+      <w:lvlJc w:val="left"/>
+      <w:pPr>
+        <w:tabs>
+          <w:tab w:val="num" w:pos="2160"/>
+        </w:tabs>
+        <w:ind w:left="2160" w:hanging="360"/>
+      </w:pPr>
+      <w:rPr>
+        <w:rFonts w:ascii="Wingdings" w:hAnsi="Wingdings" w:hint="default"/>
+        <w:sz w:val="20"/>
+      </w:rPr>
+    </w:lvl>
+    <w:lvl w:ilvl="3" w:tentative="1">
+      <w:start w:val="1"/>
+      <w:numFmt w:val="bullet"/>
+      <w:lvlText w:val=""/>
+      <w:lvlJc w:val="left"/>
+      <w:pPr>
+        <w:tabs>
+          <w:tab w:val="num" w:pos="2880"/>
+        </w:tabs>
+        <w:ind w:left="2880" w:hanging="360"/>
+      </w:pPr>
+      <w:rPr>
+        <w:rFonts w:ascii="Wingdings" w:hAnsi="Wingdings" w:hint="default"/>
+        <w:sz w:val="20"/>
+      </w:rPr>
+    </w:lvl>
+    <w:lvl w:ilvl="4" w:tentative="1">
+      <w:start w:val="1"/>
+      <w:numFmt w:val="bullet"/>
+      <w:lvlText w:val=""/>
+      <w:lvlJc w:val="left"/>
+      <w:pPr>
+        <w:tabs>
+          <w:tab w:val="num" w:pos="3600"/>
+        </w:tabs>
+        <w:ind w:left="3600" w:hanging="360"/>
+      </w:pPr>
+      <w:rPr>
+        <w:rFonts w:ascii="Wingdings" w:hAnsi="Wingdings" w:hint="default"/>
+        <w:sz w:val="20"/>
+      </w:rPr>
+    </w:lvl>
+    <w:lvl w:ilvl="5" w:tentative="1">
+      <w:start w:val="1"/>
+      <w:numFmt w:val="bullet"/>
+      <w:lvlText w:val=""/>
+      <w:lvlJc w:val="left"/>
+      <w:pPr>
+        <w:tabs>
+          <w:tab w:val="num" w:pos="4320"/>
+        </w:tabs>
+        <w:ind w:left="4320" w:hanging="360"/>
+      </w:pPr>
+      <w:rPr>
+        <w:rFonts w:ascii="Wingdings" w:hAnsi="Wingdings" w:hint="default"/>
+        <w:sz w:val="20"/>
+      </w:rPr>
+    </w:lvl>
+    <w:lvl w:ilvl="6" w:tentative="1">
+      <w:start w:val="1"/>
+      <w:numFmt w:val="bullet"/>
+      <w:lvlText w:val=""/>
+      <w:lvlJc w:val="left"/>
+      <w:pPr>
+        <w:tabs>
+          <w:tab w:val="num" w:pos="5040"/>
+        </w:tabs>
+        <w:ind w:left="5040" w:hanging="360"/>
+      </w:pPr>
+      <w:rPr>
+        <w:rFonts w:ascii="Wingdings" w:hAnsi="Wingdings" w:hint="default"/>
+        <w:sz w:val="20"/>
+      </w:rPr>
+    </w:lvl>
+    <w:lvl w:ilvl="7" w:tentative="1">
+      <w:start w:val="1"/>
+      <w:numFmt w:val="bullet"/>
+      <w:lvlText w:val=""/>
+      <w:lvlJc w:val="left"/>
+      <w:pPr>
+        <w:tabs>
+          <w:tab w:val="num" w:pos="5760"/>
+        </w:tabs>
+        <w:ind w:left="5760" w:hanging="360"/>
+      </w:pPr>
+      <w:rPr>
+        <w:rFonts w:ascii="Wingdings" w:hAnsi="Wingdings" w:hint="default"/>
+        <w:sz w:val="20"/>
+      </w:rPr>
+    </w:lvl>
+    <w:lvl w:ilvl="8" w:tentative="1">
+      <w:start w:val="1"/>
+      <w:numFmt w:val="bullet"/>
+      <w:lvlText w:val=""/>
+      <w:lvlJc w:val="left"/>
+      <w:pPr>
+        <w:tabs>
+          <w:tab w:val="num" w:pos="6480"/>
+        </w:tabs>
+        <w:ind w:left="6480" w:hanging="360"/>
+      </w:pPr>
+      <w:rPr>
+        <w:rFonts w:ascii="Wingdings" w:hAnsi="Wingdings" w:hint="default"/>
+        <w:sz w:val="20"/>
+      </w:rPr>
+    </w:lvl>
+  </w:abstractNum>
   <w:num w:numId="1" w16cid:durableId="30613362">
     <w:abstractNumId w:val="8"/>
   </w:num>
@@ -3814,6 +6306,9 @@
   </w:num>
   <w:num w:numId="9" w16cid:durableId="612129206">
     <w:abstractNumId w:val="0"/>
+  </w:num>
+  <w:num w:numId="10" w16cid:durableId="534657402">
+    <w:abstractNumId w:val="9"/>
   </w:num>
 </w:numbering>
 </file>

</xml_diff>